<commit_message>
add cambios en reclutamiento
</commit_message>
<xml_diff>
--- a/Features/GestionGthModule/Features/ReclutamientoFeature/Templates/plantilla_carta_oferta_con_placeholders.docx
+++ b/Features/GestionGthModule/Features/ReclutamientoFeature/Templates/plantilla_carta_oferta_con_placeholders.docx
@@ -132,7 +132,21 @@
           <w:rFonts w:ascii="Arial Narrow" w:hAnsi="Arial Narrow"/>
           <w:lang w:val="es-419"/>
         </w:rPr>
-        <w:t>{{FECHA_HOY}}</w:t>
+        <w:t>{{FECHA_HOY</w:t>
+      </w:r>
+      <w:r>
+        <w:rPr>
+          <w:rFonts w:ascii="Arial Narrow" w:hAnsi="Arial Narrow"/>
+          <w:lang w:val="es-419"/>
+        </w:rPr>
+        <w:t>_ENVÍO_CORREO</w:t>
+      </w:r>
+      <w:r>
+        <w:rPr>
+          <w:rFonts w:ascii="Arial Narrow" w:hAnsi="Arial Narrow"/>
+          <w:lang w:val="es-419"/>
+        </w:rPr>
+        <w:t>}}</w:t>
       </w:r>
     </w:p>
     <w:p>
@@ -159,29 +173,25 @@
       <w:r>
         <w:rPr>
           <w:rFonts w:ascii="Arial Narrow" w:hAnsi="Arial Narrow"/>
+          <w:lang w:val="es-419"/>
+        </w:rPr>
+        <w:t>Estimad</w:t>
+      </w:r>
+      <w:r>
+        <w:rPr>
+          <w:rFonts w:ascii="Arial Narrow" w:hAnsi="Arial Narrow"/>
+          <w:lang w:val="es-419"/>
+        </w:rPr>
+        <w:t xml:space="preserve">o </w:t>
+      </w:r>
+      <w:r>
+        <w:rPr>
+          <w:rFonts w:ascii="Arial Narrow" w:hAnsi="Arial Narrow"/>
           <w:b/>
           <w:bCs/>
           <w:lang w:val="es-419"/>
         </w:rPr>
-        <w:t>Estimad</w:t>
-      </w:r>
-      <w:r>
-        <w:rPr>
-          <w:rFonts w:ascii="Arial Narrow" w:hAnsi="Arial Narrow"/>
-          <w:b/>
-          <w:bCs/>
-          <w:lang w:val="es-419"/>
-        </w:rPr>
-        <w:t>a</w:t>
-      </w:r>
-      <w:r>
-        <w:rPr>
-          <w:rFonts w:ascii="Arial Narrow" w:hAnsi="Arial Narrow"/>
-          <w:b/>
-          <w:bCs/>
-          <w:lang w:val="es-419"/>
-        </w:rPr>
-        <w:t xml:space="preserve"> {{POSTULANTE_NOMBRE}}</w:t>
+        <w:t>{{POSTULANTE_NOMBRE}}</w:t>
       </w:r>
       <w:r>
         <w:rPr>
@@ -211,29 +221,154 @@
         <w:jc w:val="both"/>
         <w:rPr>
           <w:rFonts w:ascii="Arial Narrow" w:hAnsi="Arial Narrow"/>
-          <w:lang w:val="es-419"/>
+          <w:lang w:val="es-PE"/>
         </w:rPr>
       </w:pPr>
       <w:r>
         <w:rPr>
           <w:rFonts w:ascii="Arial Narrow" w:hAnsi="Arial Narrow"/>
-          <w:lang w:val="es-419"/>
-        </w:rPr>
-        <w:t>Es un placer extenderle la oportunidad de unirse a nuestro equipo en el puesto d</w:t>
+          <w:lang w:val="es-PE"/>
+        </w:rPr>
+        <w:t xml:space="preserve">Le escribimos en nombre de la empresa </w:t>
       </w:r>
       <w:r>
         <w:rPr>
           <w:rFonts w:ascii="Arial Narrow" w:hAnsi="Arial Narrow"/>
-          <w:lang w:val="es-419"/>
-        </w:rPr>
-        <w:t>e</w:t>
+          <w:b/>
+          <w:bCs/>
+          <w:lang w:val="es-PE"/>
+        </w:rPr>
+        <w:t>{{RAZON_SOCIAL}}</w:t>
       </w:r>
       <w:r>
         <w:rPr>
           <w:rFonts w:ascii="Arial Narrow" w:hAnsi="Arial Narrow"/>
+          <w:lang w:val="es-PE"/>
+        </w:rPr>
+        <w:t xml:space="preserve">. para confirmarle nuestra oferta laboral para la posición de </w:t>
+      </w:r>
+      <w:r>
+        <w:rPr>
+          <w:rFonts w:ascii="Arial Narrow" w:hAnsi="Arial Narrow"/>
           <w:b/>
           <w:bCs/>
-          <w:lang w:val="es-419"/>
+          <w:lang w:val="es-PE"/>
+        </w:rPr>
+        <w:t>{{PUESTO_NOMBRE}}</w:t>
+      </w:r>
+      <w:r>
+        <w:rPr>
+          <w:rFonts w:ascii="Arial Narrow" w:hAnsi="Arial Narrow"/>
+          <w:lang w:val="es-PE"/>
+        </w:rPr>
+        <w:t xml:space="preserve"> que debería ser efectiva a partir del </w:t>
+      </w:r>
+      <w:r>
+        <w:rPr>
+          <w:rFonts w:ascii="Arial Narrow" w:hAnsi="Arial Narrow"/>
+          <w:b/>
+          <w:bCs/>
+          <w:lang w:val="es-PE"/>
+        </w:rPr>
+        <w:t>{{FECHA_INICIO_LABORES}}</w:t>
+      </w:r>
+      <w:r>
+        <w:rPr>
+          <w:rFonts w:ascii="Arial Narrow" w:hAnsi="Arial Narrow"/>
+          <w:lang w:val="es-PE"/>
+        </w:rPr>
+        <w:t xml:space="preserve">. </w:t>
+      </w:r>
+    </w:p>
+    <w:p>
+      <w:pPr>
+        <w:spacing w:after="0" w:line="240" w:lineRule="auto"/>
+        <w:jc w:val="both"/>
+        <w:rPr>
+          <w:rFonts w:ascii="Arial Narrow" w:hAnsi="Arial Narrow"/>
+          <w:lang w:val="es-PE"/>
+        </w:rPr>
+      </w:pPr>
+    </w:p>
+    <w:p>
+      <w:pPr>
+        <w:spacing w:after="0" w:line="240" w:lineRule="auto"/>
+        <w:jc w:val="both"/>
+        <w:rPr>
+          <w:rFonts w:ascii="Arial Narrow" w:hAnsi="Arial Narrow"/>
+          <w:lang w:val="es-PE"/>
+        </w:rPr>
+      </w:pPr>
+      <w:r>
+        <w:rPr>
+          <w:rFonts w:ascii="Arial Narrow" w:hAnsi="Arial Narrow"/>
+          <w:lang w:val="es-PE"/>
+        </w:rPr>
+        <w:t xml:space="preserve">Su </w:t>
+      </w:r>
+      <w:r>
+        <w:rPr>
+          <w:rFonts w:ascii="Arial Narrow" w:hAnsi="Arial Narrow"/>
+          <w:b/>
+          <w:bCs/>
+          <w:lang w:val="es-PE"/>
+        </w:rPr>
+        <w:t>ubicación</w:t>
+      </w:r>
+      <w:r>
+        <w:rPr>
+          <w:rFonts w:ascii="Arial Narrow" w:hAnsi="Arial Narrow"/>
+          <w:lang w:val="es-PE"/>
+        </w:rPr>
+        <w:t xml:space="preserve"> de trabajo será en </w:t>
+      </w:r>
+      <w:r>
+        <w:rPr>
+          <w:rFonts w:ascii="Arial Narrow" w:hAnsi="Arial Narrow"/>
+          <w:b/>
+          <w:bCs/>
+          <w:lang w:val="es-PE"/>
+        </w:rPr>
+        <w:t>{{PROYECTO_NOMBRE}}</w:t>
+      </w:r>
+      <w:r>
+        <w:rPr>
+          <w:rFonts w:ascii="Arial Narrow" w:hAnsi="Arial Narrow"/>
+          <w:b/>
+          <w:bCs/>
+          <w:lang w:val="es-PE"/>
+        </w:rPr>
+        <w:t xml:space="preserve"> ubicado en </w:t>
+      </w:r>
+      <w:r>
+        <w:rPr>
+          <w:rFonts w:ascii="Arial Narrow" w:hAnsi="Arial Narrow"/>
+          <w:b/>
+          <w:bCs/>
+          <w:lang w:val="es-PE"/>
+        </w:rPr>
+        <w:t>{{PROYECTO_UBICACIÓN}}</w:t>
+      </w:r>
+      <w:r>
+        <w:rPr>
+          <w:rFonts w:ascii="Arial Narrow" w:hAnsi="Arial Narrow"/>
+          <w:lang w:val="es-PE"/>
+        </w:rPr>
+        <w:t xml:space="preserve">, </w:t>
+      </w:r>
+      <w:r>
+        <w:rPr>
+          <w:rFonts w:ascii="Arial Narrow" w:hAnsi="Arial Narrow"/>
+          <w:b/>
+          <w:bCs/>
+          <w:lang w:val="es-PE"/>
+        </w:rPr>
+        <w:t>distrito</w:t>
+      </w:r>
+      <w:r>
+        <w:rPr>
+          <w:rFonts w:ascii="Arial Narrow" w:hAnsi="Arial Narrow"/>
+          <w:lang w:val="es-PE"/>
         </w:rPr>
         <w:t xml:space="preserve"> </w:t>
       </w:r>
@@ -242,199 +377,89 @@
           <w:rFonts w:ascii="Arial Narrow" w:hAnsi="Arial Narrow"/>
           <w:b/>
           <w:bCs/>
-          <w:lang w:val="es-419"/>
-        </w:rPr>
-        <w:t>{{PUESTO_NOMBRE}}</w:t>
+          <w:lang w:val="es-PE"/>
+        </w:rPr>
+        <w:t>de</w:t>
       </w:r>
       <w:r>
         <w:rPr>
           <w:rFonts w:ascii="Arial Narrow" w:hAnsi="Arial Narrow"/>
-          <w:b/>
-          <w:bCs/>
-          <w:lang w:val="es-419"/>
-        </w:rPr>
-        <w:t>,</w:t>
+          <w:lang w:val="es-PE"/>
+        </w:rPr>
+        <w:t xml:space="preserve"> </w:t>
       </w:r>
       <w:r>
-        <w:rPr>
-          <w:rFonts w:ascii="Arial Narrow" w:hAnsi="Arial Narrow"/>
-          <w:lang w:val="es-419"/>
-        </w:rPr>
-        <w:t xml:space="preserve"> dicha posición reportará jerárquicamente a la </w:t>
-      </w:r>
-      <w:r>
-        <w:rPr>
-          <w:rFonts w:ascii="Arial Narrow" w:hAnsi="Arial Narrow"/>
-          <w:b/>
-          <w:bCs/>
-          <w:lang w:val="es-419"/>
-        </w:rPr>
-        <w:t>{{JEFATURA</w:t>
-      </w:r>
-      <w:r>
-        <w:rPr>
-          <w:rFonts w:ascii="Arial Narrow" w:hAnsi="Arial Narrow"/>
-          <w:b/>
-          <w:bCs/>
-          <w:lang w:val="es-419"/>
-        </w:rPr>
-        <w:t>_ÁREA</w:t>
-      </w:r>
-      <w:r>
-        <w:rPr>
-          <w:rFonts w:ascii="Arial Narrow" w:hAnsi="Arial Narrow"/>
-          <w:b/>
-          <w:bCs/>
-          <w:lang w:val="es-419"/>
-        </w:rPr>
-        <w:t>_NOMBRE}}</w:t>
-      </w:r>
-      <w:r>
-        <w:rPr>
-          <w:rFonts w:ascii="Arial Narrow" w:hAnsi="Arial Narrow"/>
-          <w:lang w:val="es-419"/>
-        </w:rPr>
-        <w:t>, siendo una excelente oportunidad para aplicar su valiosa experiencia y habilidades.</w:t>
-      </w:r>
-    </w:p>
-    <w:p>
-      <w:pPr>
-        <w:spacing w:after="0" w:line="240" w:lineRule="auto"/>
-        <w:jc w:val="both"/>
-        <w:rPr>
-          <w:rFonts w:ascii="Arial Narrow" w:hAnsi="Arial Narrow"/>
-          <w:lang w:val="es-419"/>
-        </w:rPr>
-      </w:pPr>
-    </w:p>
-    <w:p>
-      <w:pPr>
-        <w:spacing w:after="0" w:line="240" w:lineRule="auto"/>
-        <w:jc w:val="both"/>
-        <w:rPr>
-          <w:rFonts w:ascii="Arial Narrow" w:hAnsi="Arial Narrow"/>
-          <w:b/>
-          <w:bCs/>
-          <w:lang w:val="es-419"/>
-        </w:rPr>
-      </w:pPr>
-      <w:r>
-        <w:rPr>
-          <w:rFonts w:ascii="Arial Narrow" w:hAnsi="Arial Narrow"/>
-          <w:b/>
-          <w:bCs/>
-          <w:lang w:val="es-419"/>
-        </w:rPr>
-        <w:t xml:space="preserve">Nuestra propuesta remunerativa se detalla a continuación: </w:t>
-      </w:r>
-    </w:p>
-    <w:p>
-      <w:pPr>
-        <w:spacing w:after="0" w:line="240" w:lineRule="auto"/>
-        <w:jc w:val="both"/>
-        <w:rPr>
-          <w:rFonts w:ascii="Arial Narrow" w:hAnsi="Arial Narrow"/>
-          <w:b/>
-          <w:bCs/>
-          <w:lang w:val="es-419"/>
-        </w:rPr>
-      </w:pPr>
-    </w:p>
-    <w:p>
-      <w:pPr>
-        <w:pStyle w:val="Prrafodelista"/>
-        <w:numPr>
-          <w:ilvl w:val="0"/>
-          <w:numId w:val="10"/>
-        </w:numPr>
-        <w:spacing w:after="0" w:line="240" w:lineRule="auto"/>
-        <w:jc w:val="both"/>
-        <w:rPr>
-          <w:rFonts w:ascii="Arial Narrow" w:hAnsi="Arial Narrow"/>
-          <w:b/>
-          <w:bCs/>
-          <w:lang w:val="es-419"/>
-        </w:rPr>
-      </w:pPr>
-      <w:r>
-        <w:rPr>
-          <w:rFonts w:ascii="Arial Narrow" w:hAnsi="Arial Narrow"/>
-          <w:b/>
-          <w:bCs/>
-          <w:lang w:val="es-419"/>
-        </w:rPr>
-        <w:t xml:space="preserve">Sueldo Básico </w:t>
-      </w:r>
-      <w:r>
-        <w:rPr>
-          <w:rFonts w:ascii="Arial Narrow" w:hAnsi="Arial Narrow"/>
-          <w:b/>
-          <w:bCs/>
-          <w:lang w:val="es-419"/>
-        </w:rPr>
-        <w:t xml:space="preserve">Bruto </w:t>
-      </w:r>
-      <w:r>
-        <w:rPr>
-          <w:rFonts w:ascii="Arial Narrow" w:hAnsi="Arial Narrow"/>
-          <w:b/>
-          <w:bCs/>
-          <w:lang w:val="es-419"/>
-        </w:rPr>
-        <w:t>Mensual</w:t>
-      </w:r>
-      <w:r>
-        <w:rPr>
-          <w:rFonts w:ascii="Arial Narrow" w:hAnsi="Arial Narrow"/>
-          <w:b/>
-          <w:bCs/>
-          <w:lang w:val="es-419"/>
-        </w:rPr>
-        <w:t xml:space="preserve">: </w:t>
-      </w:r>
-      <w:r>
-        <w:rPr>
-          <w:rFonts w:ascii="Arial Narrow" w:hAnsi="Arial Narrow"/>
-          <w:b/>
-          <w:bCs/>
-          <w:lang w:val="es-419"/>
-        </w:rPr>
-        <w:tab/>
-        <w:t xml:space="preserve">S/. </w:t>
-      </w:r>
-      <w:r>
-        <w:rPr>
-          <w:rFonts w:ascii="Arial Narrow" w:hAnsi="Arial Narrow"/>
-          <w:b/>
-          <w:bCs/>
-          <w:lang w:val="es-419"/>
-        </w:rPr>
-        <w:t>{{SUELDO}}</w:t>
-      </w:r>
-    </w:p>
-    <w:p>
-      <w:pPr>
-        <w:spacing w:after="0" w:line="240" w:lineRule="auto"/>
-        <w:jc w:val="both"/>
-        <w:rPr>
-          <w:rFonts w:ascii="Arial Narrow" w:hAnsi="Arial Narrow"/>
-          <w:b/>
-          <w:bCs/>
-          <w:lang w:val="es-419"/>
-        </w:rPr>
-      </w:pPr>
-    </w:p>
-    <w:p>
-      <w:pPr>
-        <w:spacing w:after="0" w:line="240" w:lineRule="auto"/>
-        <w:jc w:val="both"/>
         <w:rPr>
           <w:rFonts w:ascii="Arial Narrow" w:hAnsi="Arial Narrow"/>
           <w:b/>
           <w:bCs/>
           <w:lang w:val="es-PE"/>
         </w:rPr>
-      </w:pPr>
+        <w:t>{{PROYECTO_DISTRITO}}</w:t>
+      </w:r>
+      <w:r>
+        <w:rPr>
+          <w:rFonts w:ascii="Arial Narrow" w:hAnsi="Arial Narrow"/>
+          <w:lang w:val="es-PE"/>
+        </w:rPr>
+        <w:t xml:space="preserve">, </w:t>
+      </w:r>
+      <w:r>
+        <w:rPr>
+          <w:rFonts w:ascii="Arial Narrow" w:hAnsi="Arial Narrow"/>
+          <w:lang w:val="es-PE"/>
+        </w:rPr>
+        <w:t>p</w:t>
+      </w:r>
+      <w:r>
+        <w:rPr>
+          <w:rFonts w:ascii="Arial Narrow" w:hAnsi="Arial Narrow"/>
+          <w:lang w:val="es-PE"/>
+        </w:rPr>
+        <w:t>rovincia</w:t>
+      </w:r>
+      <w:r>
+        <w:rPr>
+          <w:rFonts w:ascii="Arial Narrow" w:hAnsi="Arial Narrow"/>
+          <w:lang w:val="es-PE"/>
+        </w:rPr>
+        <w:t xml:space="preserve"> de {{PROYECTO_PROVINCIA}}</w:t>
+      </w:r>
+      <w:r>
+        <w:rPr>
+          <w:rFonts w:ascii="Arial Narrow" w:hAnsi="Arial Narrow"/>
+          <w:lang w:val="es-PE"/>
+        </w:rPr>
+        <w:t xml:space="preserve"> y departamento de </w:t>
+      </w:r>
+      <w:r>
+        <w:rPr>
+          <w:rFonts w:ascii="Arial Narrow" w:hAnsi="Arial Narrow"/>
+          <w:lang w:val="es-PE"/>
+        </w:rPr>
+        <w:t>{{PROYECTO_</w:t>
+      </w:r>
+      <w:r>
+        <w:rPr>
+          <w:rFonts w:ascii="Arial Narrow" w:hAnsi="Arial Narrow"/>
+          <w:lang w:val="es-PE"/>
+        </w:rPr>
+        <w:t>DEPARTAMENTO</w:t>
+      </w:r>
+      <w:r>
+        <w:rPr>
+          <w:rFonts w:ascii="Arial Narrow" w:hAnsi="Arial Narrow"/>
+          <w:lang w:val="es-PE"/>
+        </w:rPr>
+        <w:t>}}</w:t>
+      </w:r>
+      <w:r>
+        <w:rPr>
+          <w:rFonts w:ascii="Arial Narrow" w:hAnsi="Arial Narrow"/>
+          <w:lang w:val="es-PE"/>
+        </w:rPr>
+        <w:t xml:space="preserve">; reportando directamente sus labores a la </w:t>
+      </w:r>
       <w:r>
         <w:rPr>
           <w:rFonts w:ascii="Arial Narrow" w:hAnsi="Arial Narrow"/>
@@ -442,152 +467,12 @@
           <w:bCs/>
           <w:lang w:val="es-PE"/>
         </w:rPr>
-        <w:t xml:space="preserve">Fecha de inicio de labores: </w:t>
-      </w:r>
-    </w:p>
-    <w:p>
-      <w:pPr>
-        <w:spacing w:after="0" w:line="240" w:lineRule="auto"/>
-        <w:jc w:val="both"/>
-        <w:rPr>
-          <w:rFonts w:ascii="Arial Narrow" w:hAnsi="Arial Narrow"/>
-          <w:b/>
-          <w:bCs/>
-          <w:lang w:val="es-PE"/>
-        </w:rPr>
-      </w:pPr>
-    </w:p>
-    <w:p>
-      <w:pPr>
-        <w:pStyle w:val="Prrafodelista"/>
-        <w:numPr>
-          <w:ilvl w:val="0"/>
-          <w:numId w:val="11"/>
-        </w:numPr>
-        <w:spacing w:after="0" w:line="240" w:lineRule="auto"/>
-        <w:jc w:val="both"/>
-        <w:rPr>
-          <w:rFonts w:ascii="Arial Narrow" w:hAnsi="Arial Narrow"/>
-          <w:lang w:val="es-419"/>
-        </w:rPr>
-      </w:pPr>
-      <w:r>
-        <w:rPr>
-          <w:rFonts w:ascii="Arial Narrow" w:hAnsi="Arial Narrow"/>
-          <w:lang w:val="es-419"/>
-        </w:rPr>
-        <w:t>{{FECHA_INICIO_LABORES}}</w:t>
-      </w:r>
-    </w:p>
-    <w:p>
-      <w:pPr>
-        <w:spacing w:after="0" w:line="240" w:lineRule="auto"/>
-        <w:jc w:val="both"/>
-        <w:rPr>
-          <w:rFonts w:ascii="Arial Narrow" w:hAnsi="Arial Narrow"/>
-          <w:lang w:val="es-419"/>
-        </w:rPr>
-      </w:pPr>
-    </w:p>
-    <w:p>
-      <w:pPr>
-        <w:spacing w:after="0" w:line="240" w:lineRule="auto"/>
-        <w:jc w:val="both"/>
-        <w:rPr>
-          <w:rFonts w:ascii="Arial Narrow" w:hAnsi="Arial Narrow"/>
-          <w:b/>
-          <w:bCs/>
-          <w:lang w:val="es-419"/>
-        </w:rPr>
-      </w:pPr>
-      <w:r>
-        <w:rPr>
-          <w:rFonts w:ascii="Arial Narrow" w:hAnsi="Arial Narrow"/>
-          <w:b/>
-          <w:bCs/>
-          <w:lang w:val="es-419"/>
-        </w:rPr>
-        <w:t>Respecto a las condiciones contractuales, tenga en cuenta lo siguiente:</w:t>
-      </w:r>
-    </w:p>
-    <w:p>
-      <w:pPr>
-        <w:spacing w:after="0" w:line="240" w:lineRule="auto"/>
-        <w:jc w:val="both"/>
-        <w:rPr>
-          <w:rFonts w:ascii="Arial Narrow" w:hAnsi="Arial Narrow"/>
-          <w:lang w:val="es-419"/>
-        </w:rPr>
-      </w:pPr>
-    </w:p>
-    <w:p>
-      <w:pPr>
-        <w:pStyle w:val="Prrafodelista"/>
-        <w:numPr>
-          <w:ilvl w:val="0"/>
-          <w:numId w:val="10"/>
-        </w:numPr>
-        <w:spacing w:after="0" w:line="240" w:lineRule="auto"/>
-        <w:jc w:val="both"/>
-        <w:rPr>
-          <w:rFonts w:ascii="Arial Narrow" w:hAnsi="Arial Narrow"/>
-          <w:lang w:val="es-419"/>
-        </w:rPr>
-      </w:pPr>
-      <w:r>
-        <w:rPr>
-          <w:rFonts w:ascii="Arial Narrow" w:hAnsi="Arial Narrow"/>
-          <w:b/>
-          <w:bCs/>
-          <w:lang w:val="es-419"/>
-        </w:rPr>
-        <w:t>S</w:t>
+        <w:t>{{JEFATURA_ÁREA_NOMBRE}}</w:t>
       </w:r>
       <w:r>
         <w:rPr>
           <w:rFonts w:ascii="Arial Narrow" w:hAnsi="Arial Narrow"/>
-          <w:b/>
-          <w:bCs/>
-          <w:lang w:val="es-419"/>
-        </w:rPr>
-        <w:t>ueldo básico:</w:t>
-      </w:r>
-      <w:r>
-        <w:rPr>
-          <w:rFonts w:ascii="Arial Narrow" w:hAnsi="Arial Narrow"/>
-          <w:lang w:val="es-419"/>
-        </w:rPr>
-        <w:t xml:space="preserve"> </w:t>
-      </w:r>
-      <w:r>
-        <w:rPr>
-          <w:rFonts w:ascii="Arial Narrow" w:hAnsi="Arial Narrow"/>
-          <w:lang w:val="es-419"/>
-        </w:rPr>
-        <w:t xml:space="preserve">equivalente a 14 remuneraciones anuales, distribuidas en 12 sueldos mensuales y 2 gratificaciones </w:t>
-      </w:r>
-    </w:p>
-    <w:p>
-      <w:pPr>
-        <w:pStyle w:val="Prrafodelista"/>
-        <w:spacing w:after="0" w:line="240" w:lineRule="auto"/>
-        <w:jc w:val="both"/>
-        <w:rPr>
-          <w:rFonts w:ascii="Arial Narrow" w:hAnsi="Arial Narrow"/>
-          <w:lang w:val="es-419"/>
-        </w:rPr>
-      </w:pPr>
-      <w:r>
-        <w:rPr>
-          <w:rFonts w:ascii="Arial Narrow" w:hAnsi="Arial Narrow"/>
-          <w:lang w:val="es-419"/>
-        </w:rPr>
-        <w:t>legales (julio y diciembre), conforme a la Ley N.º 27735</w:t>
-      </w:r>
-      <w:r>
-        <w:rPr>
-          <w:rFonts w:ascii="Arial Narrow" w:hAnsi="Arial Narrow"/>
-          <w:lang w:val="es-419"/>
+          <w:lang w:val="es-PE"/>
         </w:rPr>
         <w:t>.</w:t>
       </w:r>
@@ -604,18 +489,307 @@
     </w:p>
     <w:p>
       <w:pPr>
+        <w:spacing w:after="0" w:line="240" w:lineRule="auto"/>
+        <w:jc w:val="both"/>
+        <w:rPr>
+          <w:rFonts w:ascii="Arial Narrow" w:hAnsi="Arial Narrow"/>
+          <w:b/>
+          <w:bCs/>
+          <w:lang w:val="es-PE"/>
+        </w:rPr>
+      </w:pPr>
+      <w:r>
+        <w:rPr>
+          <w:rFonts w:ascii="Arial Narrow" w:hAnsi="Arial Narrow"/>
+          <w:lang w:val="es-PE"/>
+        </w:rPr>
+        <w:t xml:space="preserve">La remuneración es acorde a la política salarial de </w:t>
+      </w:r>
+      <w:r>
+        <w:rPr>
+          <w:rFonts w:ascii="Arial Narrow" w:hAnsi="Arial Narrow"/>
+          <w:b/>
+          <w:bCs/>
+          <w:lang w:val="es-PE"/>
+        </w:rPr>
+        <w:t>{{RAZON_SOCIAL}}</w:t>
+      </w:r>
+      <w:r>
+        <w:rPr>
+          <w:rFonts w:ascii="Arial Narrow" w:hAnsi="Arial Narrow"/>
+          <w:lang w:val="es-PE"/>
+        </w:rPr>
+        <w:t xml:space="preserve"> que tiene en consideración para esta posición un salario bruto mensual de S/. </w:t>
+      </w:r>
+      <w:r>
+        <w:rPr>
+          <w:rFonts w:ascii="Arial Narrow" w:hAnsi="Arial Narrow"/>
+          <w:b/>
+          <w:bCs/>
+          <w:lang w:val="es-PE"/>
+        </w:rPr>
+        <w:t>{{SUELDO_EN_NÚMERO}}</w:t>
+      </w:r>
+      <w:r>
+        <w:rPr>
+          <w:rFonts w:ascii="Arial Narrow" w:hAnsi="Arial Narrow"/>
+          <w:b/>
+          <w:bCs/>
+          <w:lang w:val="es-PE"/>
+        </w:rPr>
+        <w:t xml:space="preserve"> (</w:t>
+      </w:r>
+      <w:r>
+        <w:rPr>
+          <w:rFonts w:ascii="Arial Narrow" w:hAnsi="Arial Narrow"/>
+          <w:b/>
+          <w:bCs/>
+          <w:lang w:val="es-PE"/>
+        </w:rPr>
+        <w:t>{{SUELDO_EN_LETRAS}}</w:t>
+      </w:r>
+      <w:r>
+        <w:rPr>
+          <w:rFonts w:ascii="Arial Narrow" w:hAnsi="Arial Narrow"/>
+          <w:b/>
+          <w:bCs/>
+          <w:lang w:val="es-PE"/>
+        </w:rPr>
+        <w:t xml:space="preserve"> soles)</w:t>
+      </w:r>
+      <w:r>
+        <w:rPr>
+          <w:rFonts w:ascii="Arial Narrow" w:hAnsi="Arial Narrow"/>
+          <w:lang w:val="es-PE"/>
+        </w:rPr>
+        <w:t xml:space="preserve"> en planilla con todos los beneficios de ley</w:t>
+      </w:r>
+      <w:r>
+        <w:rPr>
+          <w:rFonts w:ascii="Arial Narrow" w:hAnsi="Arial Narrow"/>
+          <w:lang w:val="es-PE"/>
+        </w:rPr>
+        <w:t>.</w:t>
+      </w:r>
+    </w:p>
+    <w:p>
+      <w:pPr>
+        <w:spacing w:after="0" w:line="240" w:lineRule="auto"/>
+        <w:jc w:val="both"/>
+        <w:rPr>
+          <w:rFonts w:ascii="Arial Narrow" w:hAnsi="Arial Narrow"/>
+          <w:b/>
+          <w:bCs/>
+          <w:lang w:val="es-PE"/>
+        </w:rPr>
+      </w:pPr>
+    </w:p>
+    <w:p>
+      <w:pPr>
+        <w:spacing w:after="0" w:line="240" w:lineRule="auto"/>
+        <w:jc w:val="both"/>
+        <w:rPr>
+          <w:rFonts w:ascii="Arial Narrow" w:hAnsi="Arial Narrow"/>
+          <w:b/>
+          <w:bCs/>
+          <w:lang w:val="es-PE"/>
+        </w:rPr>
+      </w:pPr>
+      <w:r>
+        <w:rPr>
+          <w:rFonts w:ascii="Arial Narrow" w:hAnsi="Arial Narrow"/>
+          <w:b/>
+          <w:bCs/>
+          <w:lang w:val="es-PE"/>
+        </w:rPr>
+        <w:t xml:space="preserve">Las condiciones de contrato se detallan a </w:t>
+      </w:r>
+      <w:r>
+        <w:rPr>
+          <w:rFonts w:ascii="Arial Narrow" w:hAnsi="Arial Narrow"/>
+          <w:b/>
+          <w:bCs/>
+          <w:lang w:val="es-PE"/>
+        </w:rPr>
+        <w:t>continuación</w:t>
+      </w:r>
+      <w:r>
+        <w:rPr>
+          <w:rFonts w:ascii="Arial Narrow" w:hAnsi="Arial Narrow"/>
+          <w:b/>
+          <w:bCs/>
+          <w:lang w:val="es-PE"/>
+        </w:rPr>
+        <w:t>:</w:t>
+      </w:r>
+    </w:p>
+    <w:p>
+      <w:pPr>
+        <w:spacing w:after="0" w:line="240" w:lineRule="auto"/>
+        <w:jc w:val="both"/>
+        <w:rPr>
+          <w:rFonts w:ascii="Arial Narrow" w:hAnsi="Arial Narrow"/>
+          <w:b/>
+          <w:bCs/>
+          <w:lang w:val="es-PE"/>
+        </w:rPr>
+      </w:pPr>
+    </w:p>
+    <w:p>
+      <w:pPr>
         <w:pStyle w:val="Prrafodelista"/>
         <w:numPr>
           <w:ilvl w:val="0"/>
-          <w:numId w:val="10"/>
+          <w:numId w:val="13"/>
         </w:numPr>
         <w:spacing w:after="0" w:line="240" w:lineRule="auto"/>
         <w:jc w:val="both"/>
         <w:rPr>
           <w:rFonts w:ascii="Arial Narrow" w:hAnsi="Arial Narrow"/>
+          <w:lang w:val="es-PE"/>
+        </w:rPr>
+      </w:pPr>
+      <w:r>
+        <w:rPr>
+          <w:rFonts w:ascii="Arial Narrow" w:hAnsi="Arial Narrow"/>
+          <w:lang w:val="es-PE"/>
+        </w:rPr>
+        <w:t>{{CONDICIONES}}</w:t>
+      </w:r>
+    </w:p>
+    <w:p>
+      <w:pPr>
+        <w:spacing w:after="0" w:line="240" w:lineRule="auto"/>
+        <w:jc w:val="both"/>
+        <w:rPr>
+          <w:rFonts w:ascii="Arial Narrow" w:hAnsi="Arial Narrow"/>
+          <w:b/>
+          <w:bCs/>
+          <w:lang w:val="es-PE"/>
+        </w:rPr>
+      </w:pPr>
+    </w:p>
+    <w:p>
+      <w:pPr>
+        <w:spacing w:after="0" w:line="240" w:lineRule="auto"/>
+        <w:jc w:val="both"/>
+        <w:rPr>
+          <w:rFonts w:ascii="Arial Narrow" w:hAnsi="Arial Narrow"/>
+          <w:b/>
+          <w:bCs/>
+          <w:lang w:val="es-PE"/>
+        </w:rPr>
+      </w:pPr>
+      <w:r>
+        <w:rPr>
+          <w:rFonts w:ascii="Arial Narrow" w:hAnsi="Arial Narrow"/>
+          <w:b/>
+          <w:bCs/>
+          <w:lang w:val="es-PE"/>
+        </w:rPr>
+        <w:t>Otros b</w:t>
+      </w:r>
+      <w:r>
+        <w:rPr>
+          <w:rFonts w:ascii="Arial Narrow" w:hAnsi="Arial Narrow"/>
+          <w:b/>
+          <w:bCs/>
+          <w:lang w:val="es-PE"/>
+        </w:rPr>
+        <w:t>eneficio</w:t>
+      </w:r>
+      <w:r>
+        <w:rPr>
+          <w:rFonts w:ascii="Arial Narrow" w:hAnsi="Arial Narrow"/>
+          <w:b/>
+          <w:bCs/>
+          <w:lang w:val="es-PE"/>
+        </w:rPr>
+        <w:t>s</w:t>
+      </w:r>
+      <w:r>
+        <w:rPr>
+          <w:rFonts w:ascii="Arial Narrow" w:hAnsi="Arial Narrow"/>
+          <w:b/>
+          <w:bCs/>
+          <w:lang w:val="es-PE"/>
+        </w:rPr>
+        <w:t>:</w:t>
+      </w:r>
+    </w:p>
+    <w:p>
+      <w:pPr>
+        <w:spacing w:after="0" w:line="240" w:lineRule="auto"/>
+        <w:jc w:val="both"/>
+        <w:rPr>
+          <w:rFonts w:ascii="Arial Narrow" w:hAnsi="Arial Narrow"/>
+          <w:b/>
+          <w:bCs/>
+          <w:lang w:val="es-PE"/>
+        </w:rPr>
+      </w:pPr>
+    </w:p>
+    <w:p>
+      <w:pPr>
+        <w:pStyle w:val="Prrafodelista"/>
+        <w:numPr>
+          <w:ilvl w:val="0"/>
+          <w:numId w:val="13"/>
+        </w:numPr>
+        <w:spacing w:after="0" w:line="240" w:lineRule="auto"/>
+        <w:jc w:val="both"/>
+        <w:rPr>
+          <w:rFonts w:ascii="Arial Narrow" w:hAnsi="Arial Narrow"/>
+          <w:b/>
+          <w:bCs/>
+          <w:lang w:val="es-PE"/>
+        </w:rPr>
+      </w:pPr>
+      <w:r>
+        <w:rPr>
+          <w:rFonts w:ascii="Arial Narrow" w:hAnsi="Arial Narrow"/>
+          <w:b/>
+          <w:bCs/>
+          <w:lang w:val="es-PE"/>
+        </w:rPr>
+        <w:t>EPS Sanitas (opcional y cubierto hasta el 60% para el titular)</w:t>
+      </w:r>
+      <w:r>
+        <w:rPr>
+          <w:rFonts w:ascii="Arial Narrow" w:hAnsi="Arial Narrow"/>
+          <w:b/>
+          <w:bCs/>
+          <w:lang w:val="es-PE"/>
+        </w:rPr>
+        <w:t>.</w:t>
+      </w:r>
+    </w:p>
+    <w:p>
+      <w:pPr>
+        <w:spacing w:after="0" w:line="240" w:lineRule="auto"/>
+        <w:jc w:val="both"/>
+        <w:rPr>
+          <w:rFonts w:ascii="Arial Narrow" w:hAnsi="Arial Narrow"/>
           <w:lang w:val="es-419"/>
         </w:rPr>
       </w:pPr>
+    </w:p>
+    <w:p>
+      <w:pPr>
+        <w:spacing w:after="0" w:line="240" w:lineRule="auto"/>
+        <w:jc w:val="both"/>
+        <w:rPr>
+          <w:rFonts w:ascii="Arial Narrow" w:hAnsi="Arial Narrow"/>
+          <w:lang w:val="es-419"/>
+        </w:rPr>
+      </w:pPr>
+      <w:r>
+        <w:rPr>
+          <w:rFonts w:ascii="Arial Narrow" w:hAnsi="Arial Narrow"/>
+          <w:lang w:val="es-419"/>
+        </w:rPr>
+        <w:t xml:space="preserve">Agradeceremos pueda confirmar su aceptación hasta el </w:t>
+      </w:r>
       <w:r>
         <w:rPr>
           <w:rFonts w:ascii="Arial Narrow" w:hAnsi="Arial Narrow"/>
@@ -623,7 +797,14 @@
           <w:bCs/>
           <w:lang w:val="es-419"/>
         </w:rPr>
-        <w:t>C</w:t>
+        <w:t>{{FECHA_LÍMITE_ACEPTACIÓN}}</w:t>
+      </w:r>
+      <w:r>
+        <w:rPr>
+          <w:rFonts w:ascii="Arial Narrow" w:hAnsi="Arial Narrow"/>
+          <w:lang w:val="es-419"/>
+        </w:rPr>
+        <w:t xml:space="preserve">. De estar conforme con lo indicado, </w:t>
       </w:r>
       <w:r>
         <w:rPr>
@@ -632,119 +813,13 @@
           <w:bCs/>
           <w:lang w:val="es-419"/>
         </w:rPr>
-        <w:t>ontrato de trabajo y su categoría</w:t>
+        <w:t>firmar el presente documento en señal de aceptación.</w:t>
       </w:r>
       <w:r>
         <w:rPr>
           <w:rFonts w:ascii="Arial Narrow" w:hAnsi="Arial Narrow"/>
-          <w:lang w:val="es-419"/>
-        </w:rPr>
-        <w:t xml:space="preserve">: </w:t>
-      </w:r>
-      <w:r>
-        <w:rPr>
-          <w:rFonts w:ascii="Arial Narrow" w:hAnsi="Arial Narrow"/>
-          <w:lang w:val="es-419"/>
-        </w:rPr>
-        <w:t xml:space="preserve">el </w:t>
-      </w:r>
-      <w:r>
-        <w:rPr>
-          <w:rFonts w:ascii="Arial Narrow" w:hAnsi="Arial Narrow"/>
-          <w:lang w:val="es-419"/>
-        </w:rPr>
-        <w:t xml:space="preserve">contrato de trabajo será sujeto a modalidad </w:t>
-      </w:r>
-      <w:r>
-        <w:rPr>
-          <w:rFonts w:ascii="Arial Narrow" w:hAnsi="Arial Narrow"/>
-          <w:lang w:val="es-419"/>
-        </w:rPr>
-        <w:t xml:space="preserve">por </w:t>
-      </w:r>
-      <w:r>
-        <w:rPr>
-          <w:rFonts w:ascii="Arial Narrow" w:hAnsi="Arial Narrow"/>
           <w:b/>
           <w:bCs/>
-          <w:lang w:val="es-419"/>
-        </w:rPr>
-        <w:t>NECESIDAD DE MERCADO</w:t>
-      </w:r>
-      <w:r>
-        <w:rPr>
-          <w:rFonts w:ascii="Arial Narrow" w:hAnsi="Arial Narrow"/>
-          <w:lang w:val="es-419"/>
-        </w:rPr>
-        <w:t xml:space="preserve">, bajo la razón social </w:t>
-      </w:r>
-      <w:r>
-        <w:rPr>
-          <w:rFonts w:ascii="Arial Narrow" w:hAnsi="Arial Narrow"/>
-          <w:b/>
-          <w:bCs/>
-          <w:lang w:val="es-419"/>
-        </w:rPr>
-        <w:t>{{RAZON_SOCIAL}}</w:t>
-      </w:r>
-      <w:r>
-        <w:rPr>
-          <w:rFonts w:ascii="Arial Narrow" w:hAnsi="Arial Narrow"/>
-          <w:lang w:val="es-419"/>
-        </w:rPr>
-        <w:t xml:space="preserve">, con una duración inicial de </w:t>
-      </w:r>
-      <w:r>
-        <w:rPr>
-          <w:rFonts w:ascii="Arial Narrow" w:hAnsi="Arial Narrow"/>
-          <w:b/>
-          <w:bCs/>
-          <w:lang w:val="es-419"/>
-        </w:rPr>
-        <w:t>0</w:t>
-      </w:r>
-      <w:r>
-        <w:rPr>
-          <w:rFonts w:ascii="Arial Narrow" w:hAnsi="Arial Narrow"/>
-          <w:b/>
-          <w:bCs/>
-          <w:lang w:val="es-419"/>
-        </w:rPr>
-        <w:t xml:space="preserve">3 </w:t>
-      </w:r>
-      <w:r>
-        <w:rPr>
-          <w:rFonts w:ascii="Arial Narrow" w:hAnsi="Arial Narrow"/>
-          <w:b/>
-          <w:bCs/>
-          <w:lang w:val="es-419"/>
-        </w:rPr>
-        <w:t>meses</w:t>
-      </w:r>
-      <w:r>
-        <w:rPr>
-          <w:rFonts w:ascii="Arial Narrow" w:hAnsi="Arial Narrow"/>
-          <w:lang w:val="es-419"/>
-        </w:rPr>
-        <w:t>, renovable según</w:t>
-      </w:r>
-      <w:r>
-        <w:rPr>
-          <w:rFonts w:ascii="Arial Narrow" w:hAnsi="Arial Narrow"/>
-          <w:lang w:val="es-419"/>
-        </w:rPr>
-        <w:t xml:space="preserve"> </w:t>
-      </w:r>
-      <w:r>
-        <w:rPr>
-          <w:rFonts w:ascii="Arial Narrow" w:hAnsi="Arial Narrow"/>
-          <w:lang w:val="es-419"/>
-        </w:rPr>
-        <w:t>necesidad de la empresa.</w:t>
-      </w:r>
-      <w:r>
-        <w:rPr>
-          <w:rFonts w:ascii="Arial Narrow" w:hAnsi="Arial Narrow"/>
           <w:lang w:val="es-419"/>
         </w:rPr>
         <w:t xml:space="preserve"> </w:t>
@@ -752,10 +827,428 @@
     </w:p>
     <w:p>
       <w:pPr>
-        <w:pStyle w:val="Prrafodelista"/>
+        <w:spacing w:after="0" w:line="240" w:lineRule="auto"/>
+        <w:jc w:val="both"/>
         <w:rPr>
           <w:rFonts w:ascii="Arial Narrow" w:hAnsi="Arial Narrow"/>
           <w:lang w:val="es-419"/>
+        </w:rPr>
+      </w:pPr>
+    </w:p>
+    <w:p>
+      <w:pPr>
+        <w:spacing w:after="0" w:line="240" w:lineRule="auto"/>
+        <w:jc w:val="both"/>
+        <w:rPr>
+          <w:rFonts w:ascii="Arial Narrow" w:hAnsi="Arial Narrow"/>
+          <w:lang w:val="es-PE"/>
+        </w:rPr>
+      </w:pPr>
+      <w:r>
+        <w:rPr>
+          <w:rFonts w:ascii="Arial Narrow" w:hAnsi="Arial Narrow"/>
+          <w:lang w:val="es-419"/>
+        </w:rPr>
+        <w:t>De antemano, agradecemos</w:t>
+      </w:r>
+      <w:r>
+        <w:rPr>
+          <w:rFonts w:ascii="Arial Narrow" w:hAnsi="Arial Narrow"/>
+          <w:lang w:val="es-419"/>
+        </w:rPr>
+        <w:t xml:space="preserve"> su interés en formar parte de nuestra organización y esperamos contar con usted para iniciar esta nueva etapa profesional.</w:t>
+      </w:r>
+    </w:p>
+    <w:p>
+      <w:pPr>
+        <w:spacing w:after="0" w:line="240" w:lineRule="auto"/>
+        <w:jc w:val="both"/>
+        <w:rPr>
+          <w:rFonts w:ascii="Arial Narrow" w:hAnsi="Arial Narrow"/>
+          <w:lang w:val="es-PE"/>
+        </w:rPr>
+      </w:pPr>
+    </w:p>
+    <w:p>
+      <w:pPr>
+        <w:spacing w:after="0" w:line="240" w:lineRule="auto"/>
+        <w:jc w:val="both"/>
+        <w:rPr>
+          <w:rFonts w:ascii="Arial Narrow" w:hAnsi="Arial Narrow"/>
+          <w:lang w:val="es-PE"/>
+        </w:rPr>
+      </w:pPr>
+    </w:p>
+    <w:p>
+      <w:pPr>
+        <w:spacing w:after="0" w:line="240" w:lineRule="auto"/>
+        <w:jc w:val="both"/>
+        <w:rPr>
+          <w:rFonts w:ascii="Arial Narrow" w:hAnsi="Arial Narrow"/>
+          <w:lang w:val="es-PE"/>
+        </w:rPr>
+      </w:pPr>
+    </w:p>
+    <w:p>
+      <w:pPr>
+        <w:spacing w:after="0" w:line="240" w:lineRule="auto"/>
+        <w:jc w:val="both"/>
+        <w:rPr>
+          <w:rFonts w:ascii="Arial Narrow" w:hAnsi="Arial Narrow"/>
+          <w:lang w:val="es-PE"/>
+        </w:rPr>
+      </w:pPr>
+    </w:p>
+    <w:p>
+      <w:pPr>
+        <w:spacing w:after="0" w:line="240" w:lineRule="auto"/>
+        <w:jc w:val="both"/>
+        <w:rPr>
+          <w:rFonts w:ascii="Arial Narrow" w:hAnsi="Arial Narrow"/>
+          <w:lang w:val="es-PE"/>
+        </w:rPr>
+      </w:pPr>
+      <w:r>
+        <w:rPr>
+          <w:rFonts w:ascii="Arial Narrow" w:hAnsi="Arial Narrow"/>
+          <w:noProof/>
+          <w:lang w:val="es-PE"/>
+        </w:rPr>
+        <w:drawing>
+          <wp:anchor distT="0" distB="0" distL="114300" distR="114300" simplePos="0" relativeHeight="251658240" behindDoc="1" locked="0" layoutInCell="1" allowOverlap="1" wp14:anchorId="302839AC" wp14:editId="78E9E27A">
+            <wp:simplePos x="0" y="0"/>
+            <wp:positionH relativeFrom="margin">
+              <wp:posOffset>1882444</wp:posOffset>
+            </wp:positionH>
+            <wp:positionV relativeFrom="paragraph">
+              <wp:posOffset>67310</wp:posOffset>
+            </wp:positionV>
+            <wp:extent cx="2385391" cy="1005412"/>
+            <wp:effectExtent l="0" t="0" r="0" b="4445"/>
+            <wp:wrapNone/>
+            <wp:docPr id="340153456" name="Imagen 1"/>
+            <wp:cNvGraphicFramePr>
+              <a:graphicFrameLocks xmlns:a="http://schemas.openxmlformats.org/drawingml/2006/main" noChangeAspect="1"/>
+            </wp:cNvGraphicFramePr>
+            <a:graphic xmlns:a="http://schemas.openxmlformats.org/drawingml/2006/main">
+              <a:graphicData uri="http://schemas.openxmlformats.org/drawingml/2006/picture">
+                <pic:pic xmlns:pic="http://schemas.openxmlformats.org/drawingml/2006/picture">
+                  <pic:nvPicPr>
+                    <pic:cNvPr id="340153456" name=""/>
+                    <pic:cNvPicPr/>
+                  </pic:nvPicPr>
+                  <pic:blipFill>
+                    <a:blip r:embed="rId11"/>
+                    <a:stretch>
+                      <a:fillRect/>
+                    </a:stretch>
+                  </pic:blipFill>
+                  <pic:spPr>
+                    <a:xfrm>
+                      <a:off x="0" y="0"/>
+                      <a:ext cx="2385391" cy="1005412"/>
+                    </a:xfrm>
+                    <a:prstGeom prst="rect">
+                      <a:avLst/>
+                    </a:prstGeom>
+                  </pic:spPr>
+                </pic:pic>
+              </a:graphicData>
+            </a:graphic>
+            <wp14:sizeRelH relativeFrom="page">
+              <wp14:pctWidth>0</wp14:pctWidth>
+            </wp14:sizeRelH>
+            <wp14:sizeRelV relativeFrom="page">
+              <wp14:pctHeight>0</wp14:pctHeight>
+            </wp14:sizeRelV>
+          </wp:anchor>
+        </w:drawing>
+      </w:r>
+    </w:p>
+    <w:p>
+      <w:pPr>
+        <w:spacing w:after="0" w:line="240" w:lineRule="auto"/>
+        <w:jc w:val="both"/>
+        <w:rPr>
+          <w:rFonts w:ascii="Arial Narrow" w:hAnsi="Arial Narrow"/>
+          <w:lang w:val="es-PE"/>
+        </w:rPr>
+      </w:pPr>
+    </w:p>
+    <w:p>
+      <w:pPr>
+        <w:spacing w:after="0" w:line="240" w:lineRule="auto"/>
+        <w:jc w:val="both"/>
+        <w:rPr>
+          <w:rFonts w:ascii="Arial Narrow" w:hAnsi="Arial Narrow"/>
+          <w:lang w:val="es-PE"/>
+        </w:rPr>
+      </w:pPr>
+    </w:p>
+    <w:p>
+      <w:pPr>
+        <w:spacing w:after="0" w:line="240" w:lineRule="auto"/>
+        <w:jc w:val="center"/>
+        <w:rPr>
+          <w:rFonts w:ascii="Arial Narrow" w:hAnsi="Arial Narrow"/>
+          <w:b/>
+          <w:bCs/>
+          <w:lang w:val="it-IT"/>
+        </w:rPr>
+      </w:pPr>
+    </w:p>
+    <w:p>
+      <w:pPr>
+        <w:spacing w:after="0" w:line="240" w:lineRule="auto"/>
+        <w:jc w:val="center"/>
+        <w:rPr>
+          <w:rFonts w:ascii="Arial Narrow" w:hAnsi="Arial Narrow"/>
+          <w:b/>
+          <w:bCs/>
+          <w:lang w:val="it-IT"/>
+        </w:rPr>
+      </w:pPr>
+    </w:p>
+    <w:p>
+      <w:pPr>
+        <w:spacing w:after="0" w:line="240" w:lineRule="auto"/>
+        <w:jc w:val="center"/>
+        <w:rPr>
+          <w:rFonts w:ascii="Arial Narrow" w:hAnsi="Arial Narrow"/>
+          <w:b/>
+          <w:bCs/>
+          <w:lang w:val="it-IT"/>
+        </w:rPr>
+      </w:pPr>
+    </w:p>
+    <w:p>
+      <w:pPr>
+        <w:spacing w:after="0" w:line="240" w:lineRule="auto"/>
+        <w:jc w:val="center"/>
+        <w:rPr>
+          <w:rFonts w:ascii="Arial Narrow" w:hAnsi="Arial Narrow"/>
+          <w:b/>
+          <w:bCs/>
+          <w:lang w:val="it-IT"/>
+        </w:rPr>
+      </w:pPr>
+    </w:p>
+    <w:p>
+      <w:pPr>
+        <w:spacing w:after="0" w:line="240" w:lineRule="auto"/>
+        <w:jc w:val="center"/>
+        <w:rPr>
+          <w:rFonts w:ascii="Arial Narrow" w:hAnsi="Arial Narrow"/>
+          <w:b/>
+          <w:bCs/>
+          <w:lang w:val="it-IT"/>
+        </w:rPr>
+      </w:pPr>
+    </w:p>
+    <w:p>
+      <w:pPr>
+        <w:spacing w:after="0" w:line="240" w:lineRule="auto"/>
+        <w:jc w:val="center"/>
+        <w:rPr>
+          <w:rFonts w:ascii="Arial Narrow" w:hAnsi="Arial Narrow"/>
+          <w:b/>
+          <w:bCs/>
+          <w:lang w:val="it-IT"/>
+        </w:rPr>
+      </w:pPr>
+    </w:p>
+    <w:p>
+      <w:pPr>
+        <w:spacing w:after="0" w:line="240" w:lineRule="auto"/>
+        <w:jc w:val="center"/>
+        <w:rPr>
+          <w:rFonts w:ascii="Arial Narrow" w:hAnsi="Arial Narrow"/>
+          <w:b/>
+          <w:bCs/>
+          <w:lang w:val="it-IT"/>
+        </w:rPr>
+      </w:pPr>
+    </w:p>
+    <w:p>
+      <w:pPr>
+        <w:spacing w:after="0" w:line="240" w:lineRule="auto"/>
+        <w:jc w:val="center"/>
+        <w:rPr>
+          <w:rFonts w:ascii="Arial Narrow" w:hAnsi="Arial Narrow"/>
+          <w:b/>
+          <w:bCs/>
+          <w:lang w:val="it-IT"/>
+        </w:rPr>
+      </w:pPr>
+    </w:p>
+    <w:p>
+      <w:pPr>
+        <w:spacing w:after="0" w:line="240" w:lineRule="auto"/>
+        <w:jc w:val="center"/>
+        <w:rPr>
+          <w:rFonts w:ascii="Arial Narrow" w:hAnsi="Arial Narrow"/>
+          <w:b/>
+          <w:bCs/>
+          <w:lang w:val="it-IT"/>
+        </w:rPr>
+      </w:pPr>
+    </w:p>
+    <w:p>
+      <w:pPr>
+        <w:spacing w:after="0" w:line="240" w:lineRule="auto"/>
+        <w:jc w:val="center"/>
+        <w:rPr>
+          <w:rFonts w:ascii="Arial Narrow" w:hAnsi="Arial Narrow"/>
+          <w:b/>
+          <w:bCs/>
+          <w:lang w:val="it-IT"/>
+        </w:rPr>
+      </w:pPr>
+    </w:p>
+    <w:p>
+      <w:pPr>
+        <w:spacing w:after="0" w:line="240" w:lineRule="auto"/>
+        <w:jc w:val="center"/>
+        <w:rPr>
+          <w:rFonts w:ascii="Arial Narrow" w:hAnsi="Arial Narrow"/>
+          <w:b/>
+          <w:bCs/>
+          <w:lang w:val="it-IT"/>
+        </w:rPr>
+      </w:pPr>
+    </w:p>
+    <w:p>
+      <w:pPr>
+        <w:spacing w:after="0" w:line="240" w:lineRule="auto"/>
+        <w:jc w:val="center"/>
+        <w:rPr>
+          <w:rFonts w:ascii="Arial Narrow" w:hAnsi="Arial Narrow"/>
+          <w:b/>
+          <w:bCs/>
+          <w:lang w:val="it-IT"/>
+        </w:rPr>
+      </w:pPr>
+    </w:p>
+    <w:p>
+      <w:pPr>
+        <w:spacing w:after="0" w:line="240" w:lineRule="auto"/>
+        <w:jc w:val="center"/>
+        <w:rPr>
+          <w:rFonts w:ascii="Arial Narrow" w:hAnsi="Arial Narrow"/>
+          <w:b/>
+          <w:bCs/>
+          <w:lang w:val="it-IT"/>
+        </w:rPr>
+      </w:pPr>
+    </w:p>
+    <w:p>
+      <w:pPr>
+        <w:spacing w:after="0" w:line="240" w:lineRule="auto"/>
+        <w:jc w:val="center"/>
+        <w:rPr>
+          <w:rFonts w:ascii="Arial Narrow" w:hAnsi="Arial Narrow"/>
+          <w:b/>
+          <w:bCs/>
+          <w:lang w:val="it-IT"/>
+        </w:rPr>
+      </w:pPr>
+    </w:p>
+    <w:p>
+      <w:pPr>
+        <w:spacing w:after="0" w:line="240" w:lineRule="auto"/>
+        <w:jc w:val="center"/>
+        <w:rPr>
+          <w:rFonts w:ascii="Arial Narrow" w:hAnsi="Arial Narrow"/>
+          <w:b/>
+          <w:bCs/>
+          <w:lang w:val="it-IT"/>
+        </w:rPr>
+      </w:pPr>
+    </w:p>
+    <w:p>
+      <w:pPr>
+        <w:spacing w:after="0" w:line="240" w:lineRule="auto"/>
+        <w:jc w:val="center"/>
+        <w:rPr>
+          <w:rFonts w:ascii="Arial Narrow" w:hAnsi="Arial Narrow"/>
+          <w:b/>
+          <w:bCs/>
+          <w:lang w:val="it-IT"/>
+        </w:rPr>
+      </w:pPr>
+    </w:p>
+    <w:p>
+      <w:pPr>
+        <w:spacing w:after="0" w:line="240" w:lineRule="auto"/>
+        <w:jc w:val="center"/>
+        <w:rPr>
+          <w:rFonts w:ascii="Arial Narrow" w:hAnsi="Arial Narrow"/>
+          <w:b/>
+          <w:bCs/>
+          <w:lang w:val="it-IT"/>
+        </w:rPr>
+      </w:pPr>
+    </w:p>
+    <w:p>
+      <w:pPr>
+        <w:spacing w:after="0" w:line="240" w:lineRule="auto"/>
+        <w:jc w:val="center"/>
+        <w:rPr>
+          <w:rFonts w:ascii="Arial Narrow" w:hAnsi="Arial Narrow"/>
+          <w:b/>
+          <w:bCs/>
+          <w:lang w:val="it-IT"/>
+        </w:rPr>
+      </w:pPr>
+    </w:p>
+    <w:p>
+      <w:pPr>
+        <w:spacing w:after="0" w:line="240" w:lineRule="auto"/>
+        <w:rPr>
+          <w:rFonts w:ascii="Arial Narrow" w:hAnsi="Arial Narrow"/>
+          <w:b/>
+          <w:bCs/>
+          <w:lang w:val="it-IT"/>
+        </w:rPr>
+      </w:pPr>
+    </w:p>
+    <w:p>
+      <w:pPr>
+        <w:spacing w:after="0" w:line="240" w:lineRule="auto"/>
+        <w:rPr>
+          <w:rFonts w:ascii="Arial Narrow" w:hAnsi="Arial Narrow"/>
+          <w:b/>
+          <w:bCs/>
+          <w:sz w:val="28"/>
+          <w:szCs w:val="28"/>
+          <w:u w:val="single"/>
+          <w:lang w:val="es-PE"/>
+        </w:rPr>
+      </w:pPr>
+      <w:r>
+        <w:rPr>
+          <w:rFonts w:ascii="Arial Narrow" w:hAnsi="Arial Narrow"/>
+          <w:b/>
+          <w:bCs/>
+          <w:sz w:val="28"/>
+          <w:szCs w:val="28"/>
+          <w:u w:val="single"/>
+          <w:lang w:val="es-PE"/>
+        </w:rPr>
+        <w:t>Formato de Aceptación de la Oferta Laboral</w:t>
+      </w:r>
+    </w:p>
+    <w:p>
+      <w:pPr>
+        <w:spacing w:after="0" w:line="240" w:lineRule="auto"/>
+        <w:rPr>
+          <w:rFonts w:ascii="Arial Narrow" w:hAnsi="Arial Narrow"/>
+          <w:b/>
+          <w:bCs/>
+          <w:sz w:val="28"/>
+          <w:szCs w:val="28"/>
+          <w:u w:val="single"/>
+          <w:lang w:val="es-PE"/>
         </w:rPr>
       </w:pPr>
     </w:p>
@@ -764,42 +1257,94 @@
         <w:pStyle w:val="Prrafodelista"/>
         <w:numPr>
           <w:ilvl w:val="0"/>
-          <w:numId w:val="10"/>
+          <w:numId w:val="13"/>
         </w:numPr>
-        <w:spacing w:after="0" w:line="240" w:lineRule="auto"/>
-        <w:jc w:val="both"/>
-        <w:rPr>
-          <w:rFonts w:ascii="Arial Narrow" w:hAnsi="Arial Narrow"/>
-          <w:lang w:val="es-419"/>
+        <w:spacing w:after="0" w:line="360" w:lineRule="auto"/>
+        <w:rPr>
+          <w:rFonts w:ascii="Arial Narrow" w:hAnsi="Arial Narrow"/>
+          <w:b/>
+          <w:bCs/>
+          <w:lang w:val="es-PE"/>
         </w:rPr>
       </w:pPr>
       <w:r>
         <w:rPr>
-          <w:rStyle w:val="Fuerte"/>
-          <w:rFonts w:ascii="Arial Narrow" w:hAnsi="Arial Narrow"/>
+          <w:rFonts w:ascii="Arial Narrow" w:hAnsi="Arial Narrow"/>
+          <w:b/>
+          <w:bCs/>
           <w:lang w:val="es-PE"/>
         </w:rPr>
-        <w:t>J</w:t>
+        <w:t xml:space="preserve">Posición: </w:t>
       </w:r>
       <w:r>
         <w:rPr>
-          <w:rStyle w:val="Fuerte"/>
-          <w:rFonts w:ascii="Arial Narrow" w:hAnsi="Arial Narrow"/>
+          <w:rFonts w:ascii="Arial Narrow" w:hAnsi="Arial Narrow"/>
+          <w:b/>
+          <w:bCs/>
           <w:lang w:val="es-PE"/>
         </w:rPr>
-        <w:t>ornada laboral</w:t>
+        <w:t>{{PUESTO_NOMBRE}}</w:t>
+      </w:r>
+    </w:p>
+    <w:p>
+      <w:pPr>
+        <w:pStyle w:val="Prrafodelista"/>
+        <w:spacing w:after="0" w:line="360" w:lineRule="auto"/>
+        <w:rPr>
+          <w:rFonts w:ascii="Arial Narrow" w:hAnsi="Arial Narrow"/>
+          <w:lang w:val="es-PE"/>
+        </w:rPr>
+      </w:pPr>
+      <w:r>
+        <w:rPr>
+          <w:rFonts w:ascii="Arial Narrow" w:hAnsi="Arial Narrow"/>
+          <w:lang w:val="es-PE"/>
+        </w:rPr>
+        <w:t xml:space="preserve">Por la siguiente </w:t>
       </w:r>
       <w:r>
         <w:rPr>
-          <w:rStyle w:val="Fuerte"/>
-          <w:rFonts w:ascii="Arial Narrow" w:hAnsi="Arial Narrow"/>
+          <w:rFonts w:ascii="Arial Narrow" w:hAnsi="Arial Narrow"/>
+          <w:b/>
+          <w:bCs/>
           <w:lang w:val="es-PE"/>
         </w:rPr>
-        <w:t>:</w:t>
+        <w:t>acepto</w:t>
       </w:r>
       <w:r>
         <w:rPr>
-          <w:rStyle w:val="Fuerte"/>
+          <w:rFonts w:ascii="Arial Narrow" w:hAnsi="Arial Narrow"/>
+          <w:lang w:val="es-PE"/>
+        </w:rPr>
+        <w:t xml:space="preserve"> la propuesta laboral que me envió </w:t>
+      </w:r>
+      <w:r>
+        <w:rPr>
+          <w:rFonts w:ascii="Arial Narrow" w:hAnsi="Arial Narrow"/>
+          <w:b/>
+          <w:bCs/>
+          <w:lang w:val="es-PE"/>
+        </w:rPr>
+        <w:t>{{RAZON_SOCIAL}}</w:t>
+      </w:r>
+      <w:r>
+        <w:rPr>
+          <w:rFonts w:ascii="Arial Narrow" w:hAnsi="Arial Narrow"/>
+          <w:lang w:val="es-PE"/>
+        </w:rPr>
+        <w:t xml:space="preserve"> en fecha </w:t>
+      </w:r>
+      <w:r>
+        <w:rPr>
+          <w:rFonts w:ascii="Arial Narrow" w:hAnsi="Arial Narrow"/>
+          <w:b/>
+          <w:bCs/>
+          <w:lang w:val="es-PE"/>
+        </w:rPr>
+        <w:t>{{FECHA_HOY_CONFORMIDAD_DE_COLABORADOR}}</w:t>
+      </w:r>
+      <w:r>
+        <w:rPr>
           <w:rFonts w:ascii="Arial Narrow" w:hAnsi="Arial Narrow"/>
           <w:lang w:val="es-PE"/>
         </w:rPr>
@@ -810,28 +1355,13 @@
           <w:rFonts w:ascii="Arial Narrow" w:hAnsi="Arial Narrow"/>
           <w:lang w:val="es-PE"/>
         </w:rPr>
-        <w:t>lunes a viernes de 7.30 a.m. a 5.00 p.m. y sábados de 7:30 a.m. a 1:00 p.m., con un día de descanso a la semana y con una hora de refrigerio diaria.</w:t>
+        <w:t>en los términos y condiciones planteadas.</w:t>
       </w:r>
     </w:p>
     <w:p>
       <w:pPr>
-        <w:spacing w:after="0" w:line="240" w:lineRule="auto"/>
-        <w:jc w:val="both"/>
-        <w:rPr>
-          <w:rFonts w:ascii="Arial Narrow" w:hAnsi="Arial Narrow"/>
-          <w:lang w:val="es-419"/>
-        </w:rPr>
-      </w:pPr>
-    </w:p>
-    <w:p>
-      <w:pPr>
         <w:pStyle w:val="Prrafodelista"/>
-        <w:numPr>
-          <w:ilvl w:val="0"/>
-          <w:numId w:val="10"/>
-        </w:numPr>
-        <w:spacing w:after="0" w:line="240" w:lineRule="auto"/>
-        <w:jc w:val="both"/>
+        <w:spacing w:after="0" w:line="360" w:lineRule="auto"/>
         <w:rPr>
           <w:rFonts w:ascii="Arial Narrow" w:hAnsi="Arial Narrow"/>
           <w:lang w:val="es-PE"/>
@@ -839,105 +1369,41 @@
       </w:pPr>
       <w:r>
         <w:rPr>
-          <w:rStyle w:val="Fuerte"/>
           <w:rFonts w:ascii="Arial Narrow" w:hAnsi="Arial Narrow"/>
           <w:lang w:val="es-PE"/>
         </w:rPr>
-        <w:t>L</w:t>
+        <w:t xml:space="preserve">Iniciaré mis labores en </w:t>
       </w:r>
       <w:r>
         <w:rPr>
-          <w:rStyle w:val="Fuerte"/>
-          <w:rFonts w:ascii="Arial Narrow" w:hAnsi="Arial Narrow"/>
+          <w:rFonts w:ascii="Arial Narrow" w:hAnsi="Arial Narrow"/>
+          <w:b/>
+          <w:bCs/>
           <w:lang w:val="es-PE"/>
         </w:rPr>
-        <w:t>ugar de trabajo</w:t>
+        <w:t>{{RAZON_SOCIAL}}</w:t>
       </w:r>
       <w:r>
         <w:rPr>
-          <w:rStyle w:val="Fuerte"/>
           <w:rFonts w:ascii="Arial Narrow" w:hAnsi="Arial Narrow"/>
           <w:lang w:val="es-PE"/>
         </w:rPr>
-        <w:t>:</w:t>
+        <w:t xml:space="preserve"> en fecha </w:t>
       </w:r>
       <w:r>
         <w:rPr>
-          <w:rStyle w:val="Fuerte"/>
-          <w:rFonts w:ascii="Arial Narrow" w:hAnsi="Arial Narrow"/>
-          <w:b w:val="0"/>
-          <w:bCs w:val="0"/>
+          <w:rFonts w:ascii="Arial Narrow" w:hAnsi="Arial Narrow"/>
+          <w:b/>
+          <w:bCs/>
           <w:lang w:val="es-PE"/>
         </w:rPr>
-        <w:t xml:space="preserve"> </w:t>
+        <w:t>{{FECHA_INICIO_LABORES}}</w:t>
       </w:r>
       <w:r>
         <w:rPr>
-          <w:rStyle w:val="Fuerte"/>
-          <w:rFonts w:ascii="Arial Narrow" w:hAnsi="Arial Narrow"/>
-          <w:lang w:val="es-PE"/>
-        </w:rPr>
-        <w:t>modalidad rotativa</w:t>
-      </w:r>
-      <w:r>
-        <w:rPr>
-          <w:rFonts w:ascii="Arial Narrow" w:hAnsi="Arial Narrow"/>
-          <w:lang w:val="es-PE"/>
-        </w:rPr>
-        <w:t xml:space="preserve">, sujeto a asignación </w:t>
-      </w:r>
-      <w:r>
-        <w:rPr>
-          <w:rFonts w:ascii="Arial Narrow" w:hAnsi="Arial Narrow"/>
-          <w:lang w:val="es-PE"/>
-        </w:rPr>
-        <w:t xml:space="preserve">a </w:t>
-      </w:r>
-      <w:r>
-        <w:rPr>
-          <w:rFonts w:ascii="Arial Narrow" w:hAnsi="Arial Narrow"/>
-          <w:lang w:val="es-PE"/>
-        </w:rPr>
-        <w:t xml:space="preserve">los distintos </w:t>
-      </w:r>
-      <w:r>
-        <w:rPr>
-          <w:rFonts w:ascii="Arial Narrow" w:hAnsi="Arial Narrow"/>
-          <w:lang w:val="es-PE"/>
-        </w:rPr>
-        <w:t xml:space="preserve">proyectos </w:t>
-      </w:r>
-      <w:r>
-        <w:rPr>
-          <w:rFonts w:ascii="Arial Narrow" w:hAnsi="Arial Narrow"/>
-          <w:lang w:val="es-PE"/>
-        </w:rPr>
-        <w:t xml:space="preserve">del grupo </w:t>
-      </w:r>
-      <w:r>
-        <w:rPr>
-          <w:rFonts w:ascii="Arial Narrow" w:hAnsi="Arial Narrow"/>
-          <w:lang w:val="es-PE"/>
-        </w:rPr>
-        <w:t xml:space="preserve">según </w:t>
-      </w:r>
-      <w:r>
-        <w:rPr>
-          <w:rFonts w:ascii="Arial Narrow" w:hAnsi="Arial Narrow"/>
-          <w:lang w:val="es-PE"/>
-        </w:rPr>
-        <w:t xml:space="preserve">el </w:t>
-      </w:r>
-      <w:r>
-        <w:rPr>
-          <w:rFonts w:ascii="Arial Narrow" w:hAnsi="Arial Narrow"/>
-          <w:lang w:val="es-PE"/>
-        </w:rPr>
-        <w:t>requerimiento de la empresa</w:t>
-      </w:r>
-      <w:r>
-        <w:rPr>
-          <w:rFonts w:ascii="Arial Narrow" w:hAnsi="Arial Narrow"/>
+          <w:rFonts w:ascii="Arial Narrow" w:hAnsi="Arial Narrow"/>
+          <w:b/>
+          <w:bCs/>
           <w:lang w:val="es-PE"/>
         </w:rPr>
         <w:t>.</w:t>
@@ -945,11 +1411,13 @@
     </w:p>
     <w:p>
       <w:pPr>
-        <w:spacing w:after="0" w:line="240" w:lineRule="auto"/>
-        <w:jc w:val="both"/>
-        <w:rPr>
-          <w:rFonts w:ascii="Arial Narrow" w:hAnsi="Arial Narrow"/>
-          <w:lang w:val="es-419"/>
+        <w:pStyle w:val="Prrafodelista"/>
+        <w:spacing w:after="0" w:line="360" w:lineRule="auto"/>
+        <w:rPr>
+          <w:rFonts w:ascii="Arial Narrow" w:hAnsi="Arial Narrow"/>
+          <w:b/>
+          <w:bCs/>
+          <w:lang w:val="es-PE"/>
         </w:rPr>
       </w:pPr>
     </w:p>
@@ -957,359 +1425,77 @@
       <w:pPr>
         <w:pStyle w:val="Prrafodelista"/>
         <w:numPr>
-          <w:ilvl w:val="0"/>
-          <w:numId w:val="10"/>
+          <w:ilvl w:val="1"/>
+          <w:numId w:val="13"/>
         </w:numPr>
-        <w:spacing w:after="0" w:line="240" w:lineRule="auto"/>
-        <w:jc w:val="both"/>
-        <w:rPr>
-          <w:rFonts w:ascii="Arial Narrow" w:hAnsi="Arial Narrow"/>
-          <w:lang w:val="es-419"/>
-        </w:rPr>
-      </w:pPr>
-      <w:r>
+        <w:spacing w:after="0" w:line="480" w:lineRule="auto"/>
         <w:rPr>
           <w:rFonts w:ascii="Arial Narrow" w:hAnsi="Arial Narrow"/>
           <w:b/>
           <w:bCs/>
-          <w:lang w:val="es-419"/>
-        </w:rPr>
-        <w:t>Seguros:</w:t>
+          <w:lang w:val="es-PE"/>
+        </w:rPr>
+      </w:pPr>
+      <w:r>
+        <w:rPr>
+          <w:rFonts w:ascii="Arial Narrow" w:hAnsi="Arial Narrow"/>
+          <w:b/>
+          <w:bCs/>
+          <w:lang w:val="es-PE"/>
+        </w:rPr>
+        <w:t>Nombre:</w:t>
       </w:r>
       <w:r>
         <w:rPr>
           <w:rFonts w:ascii="Arial Narrow" w:hAnsi="Arial Narrow"/>
-          <w:lang w:val="es-419"/>
-        </w:rPr>
-        <w:t xml:space="preserve"> desde el primer día de labores, usted estará afiliado al Seguro Social de Salud (ESSALUD)</w:t>
-      </w:r>
-      <w:r>
-        <w:rPr>
-          <w:rFonts w:ascii="Arial Narrow" w:hAnsi="Arial Narrow"/>
-          <w:lang w:val="es-419"/>
-        </w:rPr>
-        <w:t xml:space="preserve"> y </w:t>
-      </w:r>
-      <w:r>
-        <w:rPr>
-          <w:rFonts w:ascii="Arial Narrow" w:hAnsi="Arial Narrow"/>
-          <w:lang w:val="es-419"/>
-        </w:rPr>
-        <w:t>al Seguro Vida Ley, en cumplimiento con la normativa laboral.</w:t>
-      </w:r>
-      <w:r>
-        <w:rPr>
-          <w:rFonts w:ascii="Arial Narrow" w:hAnsi="Arial Narrow"/>
-          <w:lang w:val="es-419"/>
-        </w:rPr>
-        <w:t xml:space="preserve"> </w:t>
+          <w:b/>
+          <w:bCs/>
+          <w:lang w:val="es-PE"/>
+        </w:rPr>
+        <w:t xml:space="preserve"> {{POSTULANTE_NOMBRE}}</w:t>
       </w:r>
     </w:p>
     <w:p>
       <w:pPr>
-        <w:spacing w:after="0" w:line="240" w:lineRule="auto"/>
-        <w:jc w:val="both"/>
-        <w:rPr>
-          <w:rFonts w:ascii="Arial Narrow" w:hAnsi="Arial Narrow"/>
-          <w:lang w:val="es-419"/>
-        </w:rPr>
-      </w:pPr>
-    </w:p>
-    <w:p>
-      <w:pPr>
         <w:pStyle w:val="Prrafodelista"/>
         <w:numPr>
-          <w:ilvl w:val="0"/>
-          <w:numId w:val="10"/>
+          <w:ilvl w:val="1"/>
+          <w:numId w:val="13"/>
         </w:numPr>
-        <w:spacing w:after="0" w:line="240" w:lineRule="auto"/>
-        <w:jc w:val="both"/>
-        <w:rPr>
-          <w:rFonts w:ascii="Arial Narrow" w:hAnsi="Arial Narrow"/>
-          <w:lang w:val="es-419"/>
-        </w:rPr>
-      </w:pPr>
-      <w:r>
+        <w:spacing w:after="0" w:line="480" w:lineRule="auto"/>
         <w:rPr>
           <w:rFonts w:ascii="Arial Narrow" w:hAnsi="Arial Narrow"/>
           <w:b/>
           <w:bCs/>
-          <w:lang w:val="es-419"/>
-        </w:rPr>
-        <w:t>Vacaciones:</w:t>
+          <w:lang w:val="es-PE"/>
+        </w:rPr>
+      </w:pPr>
+      <w:r>
+        <w:rPr>
+          <w:rFonts w:ascii="Arial Narrow" w:hAnsi="Arial Narrow"/>
+          <w:b/>
+          <w:bCs/>
+          <w:lang w:val="es-PE"/>
+        </w:rPr>
+        <w:t>Fecha</w:t>
       </w:r>
       <w:r>
         <w:rPr>
           <w:rFonts w:ascii="Arial Narrow" w:hAnsi="Arial Narrow"/>
-          <w:lang w:val="es-419"/>
-        </w:rPr>
-        <w:t xml:space="preserve"> conforme a la legislación vigente, se otorgarán 30 días de vacaciones por cada año completo de servicios.</w:t>
-      </w:r>
-      <w:r>
-        <w:rPr>
-          <w:rFonts w:ascii="Arial Narrow" w:hAnsi="Arial Narrow"/>
-          <w:lang w:val="es-419"/>
-        </w:rPr>
-        <w:t xml:space="preserve"> </w:t>
-      </w:r>
-    </w:p>
-    <w:p>
-      <w:pPr>
-        <w:spacing w:after="0" w:line="240" w:lineRule="auto"/>
-        <w:jc w:val="both"/>
-        <w:rPr>
-          <w:rFonts w:ascii="Arial Narrow" w:hAnsi="Arial Narrow"/>
-          <w:lang w:val="es-419"/>
-        </w:rPr>
-      </w:pPr>
-    </w:p>
-    <w:p>
-      <w:pPr>
-        <w:spacing w:after="0" w:line="240" w:lineRule="auto"/>
-        <w:jc w:val="both"/>
-        <w:rPr>
-          <w:rFonts w:ascii="Arial Narrow" w:hAnsi="Arial Narrow"/>
           <w:b/>
           <w:bCs/>
-          <w:lang w:val="es-419"/>
-        </w:rPr>
-      </w:pPr>
-      <w:r>
-        <w:rPr>
-          <w:rFonts w:ascii="Arial Narrow" w:hAnsi="Arial Narrow"/>
-          <w:b/>
-          <w:bCs/>
-          <w:lang w:val="es-419"/>
-        </w:rPr>
-        <w:t>Otros beneficios:</w:t>
-      </w:r>
-    </w:p>
-    <w:p>
-      <w:pPr>
-        <w:spacing w:after="0" w:line="240" w:lineRule="auto"/>
-        <w:jc w:val="both"/>
-        <w:rPr>
-          <w:rFonts w:ascii="Arial Narrow" w:hAnsi="Arial Narrow"/>
-          <w:lang w:val="es-419"/>
-        </w:rPr>
-      </w:pPr>
-    </w:p>
-    <w:p>
-      <w:pPr>
-        <w:pStyle w:val="Prrafodelista"/>
-        <w:numPr>
-          <w:ilvl w:val="0"/>
-          <w:numId w:val="10"/>
-        </w:numPr>
-        <w:spacing w:after="0" w:line="240" w:lineRule="auto"/>
-        <w:jc w:val="both"/>
-        <w:rPr>
-          <w:rFonts w:ascii="Arial Narrow" w:hAnsi="Arial Narrow"/>
-          <w:lang w:val="es-419"/>
-        </w:rPr>
-      </w:pPr>
-      <w:r>
-        <w:rPr>
-          <w:rFonts w:ascii="Arial Narrow" w:hAnsi="Arial Narrow"/>
-          <w:b/>
-          <w:bCs/>
-          <w:lang w:val="es-419"/>
-        </w:rPr>
-        <w:t>EPS</w:t>
-      </w:r>
-      <w:r>
-        <w:rPr>
-          <w:rFonts w:ascii="Arial Narrow" w:hAnsi="Arial Narrow"/>
-          <w:lang w:val="es-419"/>
+          <w:lang w:val="es-PE"/>
         </w:rPr>
         <w:t xml:space="preserve">: </w:t>
       </w:r>
       <w:r>
         <w:rPr>
           <w:rFonts w:ascii="Arial Narrow" w:hAnsi="Arial Narrow"/>
-          <w:lang w:val="es-419"/>
-        </w:rPr>
-        <w:t xml:space="preserve">podrás contar con la oportunidad de afiliarte a </w:t>
-      </w:r>
-      <w:r>
-        <w:rPr>
-          <w:rFonts w:ascii="Arial Narrow" w:hAnsi="Arial Narrow"/>
-          <w:lang w:val="es-419"/>
-        </w:rPr>
-        <w:t xml:space="preserve">nuestro plan de salud EPS, con cobertura al </w:t>
-      </w:r>
-      <w:r>
-        <w:rPr>
-          <w:rFonts w:ascii="Arial Narrow" w:hAnsi="Arial Narrow"/>
-          <w:lang w:val="es-419"/>
-        </w:rPr>
-        <w:t>60</w:t>
-      </w:r>
-      <w:r>
-        <w:rPr>
-          <w:rFonts w:ascii="Arial Narrow" w:hAnsi="Arial Narrow"/>
-          <w:lang w:val="es-419"/>
-        </w:rPr>
-        <w:t xml:space="preserve">% </w:t>
-      </w:r>
-      <w:r>
-        <w:rPr>
-          <w:rFonts w:ascii="Arial Narrow" w:hAnsi="Arial Narrow"/>
-          <w:lang w:val="es-419"/>
-        </w:rPr>
-        <w:t xml:space="preserve">para el titular. </w:t>
-      </w:r>
-    </w:p>
-    <w:p>
-      <w:pPr>
-        <w:spacing w:after="0" w:line="240" w:lineRule="auto"/>
-        <w:jc w:val="both"/>
-        <w:rPr>
-          <w:rFonts w:ascii="Arial Narrow" w:hAnsi="Arial Narrow"/>
-          <w:lang w:val="es-419"/>
-        </w:rPr>
-      </w:pPr>
-    </w:p>
-    <w:p>
-      <w:pPr>
-        <w:spacing w:after="0" w:line="240" w:lineRule="auto"/>
-        <w:jc w:val="both"/>
-        <w:rPr>
-          <w:rFonts w:ascii="Arial Narrow" w:hAnsi="Arial Narrow"/>
-          <w:lang w:val="es-419"/>
-        </w:rPr>
-      </w:pPr>
-      <w:r>
-        <w:rPr>
-          <w:rFonts w:ascii="Arial Narrow" w:hAnsi="Arial Narrow"/>
-          <w:lang w:val="es-419"/>
-        </w:rPr>
-        <w:t xml:space="preserve">Agradeceremos pueda confirmar su aceptación hasta el </w:t>
-      </w:r>
-      <w:r>
-        <w:rPr>
-          <w:rFonts w:ascii="Arial Narrow" w:hAnsi="Arial Narrow"/>
           <w:b/>
           <w:bCs/>
-          <w:lang w:val="es-419"/>
-        </w:rPr>
-        <w:t>{{FECHA_LÍMITE_ACEPTACIÓN}}</w:t>
-      </w:r>
-      <w:r>
-        <w:rPr>
-          <w:rFonts w:ascii="Arial Narrow" w:hAnsi="Arial Narrow"/>
-          <w:lang w:val="es-419"/>
-        </w:rPr>
-        <w:t xml:space="preserve">. De estar conforme con lo indicado, </w:t>
-      </w:r>
-      <w:r>
-        <w:rPr>
-          <w:rFonts w:ascii="Arial Narrow" w:hAnsi="Arial Narrow"/>
-          <w:b/>
-          <w:bCs/>
-          <w:lang w:val="es-419"/>
-        </w:rPr>
-        <w:t>firmar el presente documento en señal de aceptación.</w:t>
-      </w:r>
-      <w:r>
-        <w:rPr>
-          <w:rFonts w:ascii="Arial Narrow" w:hAnsi="Arial Narrow"/>
-          <w:b/>
-          <w:bCs/>
-          <w:lang w:val="es-419"/>
-        </w:rPr>
-        <w:t xml:space="preserve"> </w:t>
-      </w:r>
-    </w:p>
-    <w:p>
-      <w:pPr>
-        <w:spacing w:after="0" w:line="240" w:lineRule="auto"/>
-        <w:jc w:val="both"/>
-        <w:rPr>
-          <w:rFonts w:ascii="Arial Narrow" w:hAnsi="Arial Narrow"/>
-          <w:lang w:val="es-419"/>
-        </w:rPr>
-      </w:pPr>
-    </w:p>
-    <w:p>
-      <w:pPr>
-        <w:spacing w:after="0" w:line="240" w:lineRule="auto"/>
-        <w:jc w:val="both"/>
-        <w:rPr>
-          <w:rFonts w:ascii="Arial Narrow" w:hAnsi="Arial Narrow"/>
           <w:lang w:val="es-PE"/>
         </w:rPr>
-      </w:pPr>
-      <w:r>
-        <w:rPr>
-          <w:rFonts w:ascii="Arial Narrow" w:hAnsi="Arial Narrow"/>
-          <w:lang w:val="es-419"/>
-        </w:rPr>
-        <w:t>De antemano, agradecemos</w:t>
-      </w:r>
-      <w:r>
-        <w:rPr>
-          <w:rFonts w:ascii="Arial Narrow" w:hAnsi="Arial Narrow"/>
-          <w:lang w:val="es-419"/>
-        </w:rPr>
-        <w:t xml:space="preserve"> su interés en formar parte de nuestra organización y esperamos contar con</w:t>
-      </w:r>
-      <w:r>
-        <w:rPr>
-          <w:rFonts w:ascii="Arial Narrow" w:hAnsi="Arial Narrow"/>
-          <w:lang w:val="es-419"/>
-        </w:rPr>
-        <w:t xml:space="preserve">tigo </w:t>
-      </w:r>
-      <w:r>
-        <w:rPr>
-          <w:rFonts w:ascii="Arial Narrow" w:hAnsi="Arial Narrow"/>
-          <w:lang w:val="es-419"/>
-        </w:rPr>
-        <w:t>para iniciar esta nueva etapa profesional.</w:t>
-      </w:r>
-    </w:p>
-    <w:p>
-      <w:pPr>
-        <w:spacing w:after="0" w:line="240" w:lineRule="auto"/>
-        <w:jc w:val="both"/>
-        <w:rPr>
-          <w:rFonts w:ascii="Arial Narrow" w:hAnsi="Arial Narrow"/>
-          <w:lang w:val="es-PE"/>
-        </w:rPr>
-      </w:pPr>
-    </w:p>
-    <w:p>
-      <w:pPr>
-        <w:spacing w:after="0" w:line="240" w:lineRule="auto"/>
-        <w:jc w:val="center"/>
-        <w:rPr>
-          <w:rFonts w:ascii="Arial Narrow" w:hAnsi="Arial Narrow"/>
-          <w:b/>
-          <w:bCs/>
-          <w:lang w:val="it-IT"/>
-        </w:rPr>
-      </w:pPr>
-    </w:p>
-    <w:p>
-      <w:pPr>
-        <w:spacing w:after="0" w:line="240" w:lineRule="auto"/>
-        <w:jc w:val="center"/>
-        <w:rPr>
-          <w:rFonts w:ascii="Arial Narrow" w:hAnsi="Arial Narrow"/>
-          <w:b/>
-          <w:bCs/>
-          <w:lang w:val="it-IT"/>
-        </w:rPr>
-      </w:pPr>
-      <w:r>
-        <w:rPr>
-          <w:rFonts w:ascii="Arial Narrow" w:hAnsi="Arial Narrow"/>
-          <w:b/>
-          <w:bCs/>
-          <w:lang w:val="it-IT"/>
-        </w:rPr>
-        <w:t>ABRIL GRUPO INMOBILIARIO</w:t>
+        <w:t>{{FECHA_HOY_CONFORMIDAD_DE_COLABORADOR}}</w:t>
       </w:r>
     </w:p>
     <w:sectPr>
@@ -1496,6 +1682,118 @@
     </w:lvl>
   </w:abstractNum>
   <w:abstractNum w:abstractNumId="9" w15:restartNumberingAfterBreak="0">
+    <w:nsid w:val="0BA01C24"/>
+    <w:multiLevelType w:val="hybridMultilevel"/>
+    <w:tmpl w:val="D32E1770"/>
+    <w:lvl w:ilvl="0" w:tplc="DFBE1CCA">
+      <w:numFmt w:val="bullet"/>
+      <w:lvlText w:val="-"/>
+      <w:lvlJc w:val="left"/>
+      <w:pPr>
+        <w:ind w:left="720" w:hanging="360"/>
+      </w:pPr>
+      <w:rPr>
+        <w:rFonts w:ascii="Arial Narrow" w:eastAsiaTheme="minorEastAsia" w:hAnsi="Arial Narrow" w:cstheme="minorBidi" w:hint="default"/>
+      </w:rPr>
+    </w:lvl>
+    <w:lvl w:ilvl="1" w:tplc="280A0003">
+      <w:start w:val="1"/>
+      <w:numFmt w:val="bullet"/>
+      <w:lvlText w:val="o"/>
+      <w:lvlJc w:val="left"/>
+      <w:pPr>
+        <w:ind w:left="1440" w:hanging="360"/>
+      </w:pPr>
+      <w:rPr>
+        <w:rFonts w:ascii="Courier New" w:hAnsi="Courier New" w:cs="Courier New" w:hint="default"/>
+      </w:rPr>
+    </w:lvl>
+    <w:lvl w:ilvl="2" w:tplc="280A0005" w:tentative="1">
+      <w:start w:val="1"/>
+      <w:numFmt w:val="bullet"/>
+      <w:lvlText w:val=""/>
+      <w:lvlJc w:val="left"/>
+      <w:pPr>
+        <w:ind w:left="2160" w:hanging="360"/>
+      </w:pPr>
+      <w:rPr>
+        <w:rFonts w:ascii="Wingdings" w:hAnsi="Wingdings" w:hint="default"/>
+      </w:rPr>
+    </w:lvl>
+    <w:lvl w:ilvl="3" w:tplc="280A0001" w:tentative="1">
+      <w:start w:val="1"/>
+      <w:numFmt w:val="bullet"/>
+      <w:lvlText w:val=""/>
+      <w:lvlJc w:val="left"/>
+      <w:pPr>
+        <w:ind w:left="2880" w:hanging="360"/>
+      </w:pPr>
+      <w:rPr>
+        <w:rFonts w:ascii="Symbol" w:hAnsi="Symbol" w:hint="default"/>
+      </w:rPr>
+    </w:lvl>
+    <w:lvl w:ilvl="4" w:tplc="280A0003" w:tentative="1">
+      <w:start w:val="1"/>
+      <w:numFmt w:val="bullet"/>
+      <w:lvlText w:val="o"/>
+      <w:lvlJc w:val="left"/>
+      <w:pPr>
+        <w:ind w:left="3600" w:hanging="360"/>
+      </w:pPr>
+      <w:rPr>
+        <w:rFonts w:ascii="Courier New" w:hAnsi="Courier New" w:cs="Courier New" w:hint="default"/>
+      </w:rPr>
+    </w:lvl>
+    <w:lvl w:ilvl="5" w:tplc="280A0005" w:tentative="1">
+      <w:start w:val="1"/>
+      <w:numFmt w:val="bullet"/>
+      <w:lvlText w:val=""/>
+      <w:lvlJc w:val="left"/>
+      <w:pPr>
+        <w:ind w:left="4320" w:hanging="360"/>
+      </w:pPr>
+      <w:rPr>
+        <w:rFonts w:ascii="Wingdings" w:hAnsi="Wingdings" w:hint="default"/>
+      </w:rPr>
+    </w:lvl>
+    <w:lvl w:ilvl="6" w:tplc="280A0001" w:tentative="1">
+      <w:start w:val="1"/>
+      <w:numFmt w:val="bullet"/>
+      <w:lvlText w:val=""/>
+      <w:lvlJc w:val="left"/>
+      <w:pPr>
+        <w:ind w:left="5040" w:hanging="360"/>
+      </w:pPr>
+      <w:rPr>
+        <w:rFonts w:ascii="Symbol" w:hAnsi="Symbol" w:hint="default"/>
+      </w:rPr>
+    </w:lvl>
+    <w:lvl w:ilvl="7" w:tplc="280A0003" w:tentative="1">
+      <w:start w:val="1"/>
+      <w:numFmt w:val="bullet"/>
+      <w:lvlText w:val="o"/>
+      <w:lvlJc w:val="left"/>
+      <w:pPr>
+        <w:ind w:left="5760" w:hanging="360"/>
+      </w:pPr>
+      <w:rPr>
+        <w:rFonts w:ascii="Courier New" w:hAnsi="Courier New" w:cs="Courier New" w:hint="default"/>
+      </w:rPr>
+    </w:lvl>
+    <w:lvl w:ilvl="8" w:tplc="280A0005" w:tentative="1">
+      <w:start w:val="1"/>
+      <w:numFmt w:val="bullet"/>
+      <w:lvlText w:val=""/>
+      <w:lvlJc w:val="left"/>
+      <w:pPr>
+        <w:ind w:left="6480" w:hanging="360"/>
+      </w:pPr>
+      <w:rPr>
+        <w:rFonts w:ascii="Wingdings" w:hAnsi="Wingdings" w:hint="default"/>
+      </w:rPr>
+    </w:lvl>
+  </w:abstractNum>
+  <w:abstractNum w:abstractNumId="10" w15:restartNumberingAfterBreak="0">
     <w:nsid w:val="13A264FD"/>
     <w:multiLevelType w:val="hybridMultilevel"/>
     <w:tmpl w:val="B52251AA"/>
@@ -1608,10 +1906,123 @@
       </w:rPr>
     </w:lvl>
   </w:abstractNum>
-  <w:abstractNum w:abstractNumId="10" w15:restartNumberingAfterBreak="0">
+  <w:abstractNum w:abstractNumId="11" w15:restartNumberingAfterBreak="0">
     <w:nsid w:val="36202062"/>
     <w:multiLevelType w:val="hybridMultilevel"/>
     <w:tmpl w:val="2D5CA6F0"/>
+    <w:lvl w:ilvl="0" w:tplc="280A0001">
+      <w:start w:val="1"/>
+      <w:numFmt w:val="bullet"/>
+      <w:lvlText w:val=""/>
+      <w:lvlJc w:val="left"/>
+      <w:pPr>
+        <w:ind w:left="720" w:hanging="360"/>
+      </w:pPr>
+      <w:rPr>
+        <w:rFonts w:ascii="Symbol" w:hAnsi="Symbol" w:hint="default"/>
+      </w:rPr>
+    </w:lvl>
+    <w:lvl w:ilvl="1" w:tplc="280A0003" w:tentative="1">
+      <w:start w:val="1"/>
+      <w:numFmt w:val="bullet"/>
+      <w:lvlText w:val="o"/>
+      <w:lvlJc w:val="left"/>
+      <w:pPr>
+        <w:ind w:left="1440" w:hanging="360"/>
+      </w:pPr>
+      <w:rPr>
+        <w:rFonts w:ascii="Courier New" w:hAnsi="Courier New" w:cs="Courier New" w:hint="default"/>
+      </w:rPr>
+    </w:lvl>
+    <w:lvl w:ilvl="2" w:tplc="280A0005" w:tentative="1">
+      <w:start w:val="1"/>
+      <w:numFmt w:val="bullet"/>
+      <w:lvlText w:val=""/>
+      <w:lvlJc w:val="left"/>
+      <w:pPr>
+        <w:ind w:left="2160" w:hanging="360"/>
+      </w:pPr>
+      <w:rPr>
+        <w:rFonts w:ascii="Wingdings" w:hAnsi="Wingdings" w:hint="default"/>
+      </w:rPr>
+    </w:lvl>
+    <w:lvl w:ilvl="3" w:tplc="280A0001" w:tentative="1">
+      <w:start w:val="1"/>
+      <w:numFmt w:val="bullet"/>
+      <w:lvlText w:val=""/>
+      <w:lvlJc w:val="left"/>
+      <w:pPr>
+        <w:ind w:left="2880" w:hanging="360"/>
+      </w:pPr>
+      <w:rPr>
+        <w:rFonts w:ascii="Symbol" w:hAnsi="Symbol" w:hint="default"/>
+      </w:rPr>
+    </w:lvl>
+    <w:lvl w:ilvl="4" w:tplc="280A0003" w:tentative="1">
+      <w:start w:val="1"/>
+      <w:numFmt w:val="bullet"/>
+      <w:lvlText w:val="o"/>
+      <w:lvlJc w:val="left"/>
+      <w:pPr>
+        <w:ind w:left="3600" w:hanging="360"/>
+      </w:pPr>
+      <w:rPr>
+        <w:rFonts w:ascii="Courier New" w:hAnsi="Courier New" w:cs="Courier New" w:hint="default"/>
+      </w:rPr>
+    </w:lvl>
+    <w:lvl w:ilvl="5" w:tplc="280A0005" w:tentative="1">
+      <w:start w:val="1"/>
+      <w:numFmt w:val="bullet"/>
+      <w:lvlText w:val=""/>
+      <w:lvlJc w:val="left"/>
+      <w:pPr>
+        <w:ind w:left="4320" w:hanging="360"/>
+      </w:pPr>
+      <w:rPr>
+        <w:rFonts w:ascii="Wingdings" w:hAnsi="Wingdings" w:hint="default"/>
+      </w:rPr>
+    </w:lvl>
+    <w:lvl w:ilvl="6" w:tplc="280A0001" w:tentative="1">
+      <w:start w:val="1"/>
+      <w:numFmt w:val="bullet"/>
+      <w:lvlText w:val=""/>
+      <w:lvlJc w:val="left"/>
+      <w:pPr>
+        <w:ind w:left="5040" w:hanging="360"/>
+      </w:pPr>
+      <w:rPr>
+        <w:rFonts w:ascii="Symbol" w:hAnsi="Symbol" w:hint="default"/>
+      </w:rPr>
+    </w:lvl>
+    <w:lvl w:ilvl="7" w:tplc="280A0003" w:tentative="1">
+      <w:start w:val="1"/>
+      <w:numFmt w:val="bullet"/>
+      <w:lvlText w:val="o"/>
+      <w:lvlJc w:val="left"/>
+      <w:pPr>
+        <w:ind w:left="5760" w:hanging="360"/>
+      </w:pPr>
+      <w:rPr>
+        <w:rFonts w:ascii="Courier New" w:hAnsi="Courier New" w:cs="Courier New" w:hint="default"/>
+      </w:rPr>
+    </w:lvl>
+    <w:lvl w:ilvl="8" w:tplc="280A0005" w:tentative="1">
+      <w:start w:val="1"/>
+      <w:numFmt w:val="bullet"/>
+      <w:lvlText w:val=""/>
+      <w:lvlJc w:val="left"/>
+      <w:pPr>
+        <w:ind w:left="6480" w:hanging="360"/>
+      </w:pPr>
+      <w:rPr>
+        <w:rFonts w:ascii="Wingdings" w:hAnsi="Wingdings" w:hint="default"/>
+      </w:rPr>
+    </w:lvl>
+  </w:abstractNum>
+  <w:abstractNum w:abstractNumId="12" w15:restartNumberingAfterBreak="0">
+    <w:nsid w:val="462B1D46"/>
+    <w:multiLevelType w:val="hybridMultilevel"/>
+    <w:tmpl w:val="677C9042"/>
     <w:lvl w:ilvl="0" w:tplc="280A0001">
       <w:start w:val="1"/>
       <w:numFmt w:val="bullet"/>
@@ -1749,10 +2160,16 @@
     <w:abstractNumId w:val="0"/>
   </w:num>
   <w:num w:numId="10" w16cid:durableId="1740790800">
-    <w:abstractNumId w:val="9"/>
+    <w:abstractNumId w:val="10"/>
   </w:num>
   <w:num w:numId="11" w16cid:durableId="429471378">
-    <w:abstractNumId w:val="10"/>
+    <w:abstractNumId w:val="11"/>
+  </w:num>
+  <w:num w:numId="12" w16cid:durableId="621158106">
+    <w:abstractNumId w:val="12"/>
+  </w:num>
+  <w:num w:numId="13" w16cid:durableId="1131049744">
+    <w:abstractNumId w:val="9"/>
   </w:num>
 </w:numbering>
 </file>
@@ -13140,6 +13557,74 @@
       </w:tcPr>
     </w:tblStylePr>
   </w:style>
+  <w:style w:type="character" w:styleId="Refdecomentario">
+    <w:name w:val="annotation reference"/>
+    <w:basedOn w:val="Fuentedeprrafopredeter"/>
+    <w:uiPriority w:val="99"/>
+    <w:semiHidden/>
+    <w:unhideWhenUsed/>
+    <w:rsid w:val="006717C1"/>
+    <w:rPr>
+      <w:sz w:val="16"/>
+      <w:szCs w:val="16"/>
+    </w:rPr>
+  </w:style>
+  <w:style w:type="paragraph" w:styleId="Textocomentario">
+    <w:name w:val="annotation text"/>
+    <w:basedOn w:val="Normal"/>
+    <w:link w:val="TextocomentarioCar"/>
+    <w:uiPriority w:val="99"/>
+    <w:unhideWhenUsed/>
+    <w:rsid w:val="006717C1"/>
+    <w:pPr>
+      <w:spacing w:line="240" w:lineRule="auto"/>
+    </w:pPr>
+    <w:rPr>
+      <w:sz w:val="20"/>
+      <w:szCs w:val="20"/>
+    </w:rPr>
+  </w:style>
+  <w:style w:type="character" w:customStyle="1" w:styleId="TextocomentarioCar">
+    <w:name w:val="Texto comentario Car"/>
+    <w:basedOn w:val="Fuentedeprrafopredeter"/>
+    <w:link w:val="Textocomentario"/>
+    <w:uiPriority w:val="99"/>
+    <w:rsid w:val="006717C1"/>
+    <w:rPr>
+      <w:rFonts w:ascii="Calibri" w:hAnsi="Calibri"/>
+      <w:sz w:val="20"/>
+      <w:szCs w:val="20"/>
+    </w:rPr>
+  </w:style>
+  <w:style w:type="paragraph" w:styleId="Asuntodelcomentario">
+    <w:name w:val="annotation subject"/>
+    <w:basedOn w:val="Textocomentario"/>
+    <w:next w:val="Textocomentario"/>
+    <w:link w:val="AsuntodelcomentarioCar"/>
+    <w:uiPriority w:val="99"/>
+    <w:semiHidden/>
+    <w:unhideWhenUsed/>
+    <w:rsid w:val="006717C1"/>
+    <w:rPr>
+      <w:b/>
+      <w:bCs/>
+    </w:rPr>
+  </w:style>
+  <w:style w:type="character" w:customStyle="1" w:styleId="AsuntodelcomentarioCar">
+    <w:name w:val="Asunto del comentario Car"/>
+    <w:basedOn w:val="TextocomentarioCar"/>
+    <w:link w:val="Asuntodelcomentario"/>
+    <w:uiPriority w:val="99"/>
+    <w:semiHidden/>
+    <w:rsid w:val="006717C1"/>
+    <w:rPr>
+      <w:rFonts w:ascii="Calibri" w:hAnsi="Calibri"/>
+      <w:b/>
+      <w:bCs/>
+      <w:sz w:val="20"/>
+      <w:szCs w:val="20"/>
+    </w:rPr>
+  </w:style>
 </w:styles>
 </file>
 

</xml_diff>